<commit_message>
Relatório em PDF e Word com as decisões de 08/10
Co-Authored-By: Claude Opus 5.5 <noreply@anthropic.com>
Claude-Session: https://claude.ai/code/session_01UHc81TeezmNGrHtWtmy3jN
</commit_message>
<xml_diff>
--- a/docs/frontend/auditoria-2026-10-07.docx
+++ b/docs/frontend/auditoria-2026-10-07.docx
@@ -540,7 +540,7 @@
         <w:spacing w:after="50" w:before="0" w:line="252" w:lineRule="auto"/>
         <w:ind w:left="360"/>
       </w:pPr>
-      <w:hyperlink w:history="1" w:anchor="r_16">
+      <w:hyperlink w:history="1" w:anchor="r_17">
         <w:r>
           <w:rPr>
             <w:rFonts w:ascii="Arial" w:cs="Arial" w:eastAsia="Arial" w:hAnsi="Arial"/>
@@ -557,7 +557,7 @@
         <w:spacing w:after="50" w:before="0" w:line="252" w:lineRule="auto"/>
         <w:ind w:left="360"/>
       </w:pPr>
-      <w:hyperlink w:history="1" w:anchor="r_18">
+      <w:hyperlink w:history="1" w:anchor="r_19">
         <w:r>
           <w:rPr>
             <w:rFonts w:ascii="Arial" w:cs="Arial" w:eastAsia="Arial" w:hAnsi="Arial"/>
@@ -574,7 +574,7 @@
         <w:spacing w:after="50" w:before="0" w:line="252" w:lineRule="auto"/>
         <w:ind w:left="360"/>
       </w:pPr>
-      <w:hyperlink w:history="1" w:anchor="r_20">
+      <w:hyperlink w:history="1" w:anchor="r_21">
         <w:r>
           <w:rPr>
             <w:rFonts w:ascii="Arial" w:cs="Arial" w:eastAsia="Arial" w:hAnsi="Arial"/>
@@ -591,7 +591,7 @@
         <w:spacing w:after="50" w:before="0" w:line="252" w:lineRule="auto"/>
         <w:ind w:left="360"/>
       </w:pPr>
-      <w:hyperlink w:history="1" w:anchor="r_22">
+      <w:hyperlink w:history="1" w:anchor="r_23">
         <w:r>
           <w:rPr>
             <w:rFonts w:ascii="Arial" w:cs="Arial" w:eastAsia="Arial" w:hAnsi="Arial"/>
@@ -608,7 +608,7 @@
         <w:spacing w:after="50" w:before="0" w:line="252" w:lineRule="auto"/>
         <w:ind w:left="360"/>
       </w:pPr>
-      <w:hyperlink w:history="1" w:anchor="r_24">
+      <w:hyperlink w:history="1" w:anchor="r_25">
         <w:r>
           <w:rPr>
             <w:rFonts w:ascii="Arial" w:cs="Arial" w:eastAsia="Arial" w:hAnsi="Arial"/>
@@ -625,7 +625,7 @@
         <w:spacing w:after="50" w:before="0" w:line="252" w:lineRule="auto"/>
         <w:ind w:left="360"/>
       </w:pPr>
-      <w:hyperlink w:history="1" w:anchor="r_26">
+      <w:hyperlink w:history="1" w:anchor="r_27">
         <w:r>
           <w:rPr>
             <w:rFonts w:ascii="Arial" w:cs="Arial" w:eastAsia="Arial" w:hAnsi="Arial"/>
@@ -642,7 +642,7 @@
         <w:spacing w:after="50" w:before="0" w:line="252" w:lineRule="auto"/>
         <w:ind w:left="360"/>
       </w:pPr>
-      <w:hyperlink w:history="1" w:anchor="r_29">
+      <w:hyperlink w:history="1" w:anchor="r_30">
         <w:r>
           <w:rPr>
             <w:rFonts w:ascii="Arial" w:cs="Arial" w:eastAsia="Arial" w:hAnsi="Arial"/>
@@ -659,7 +659,7 @@
         <w:spacing w:after="50" w:before="0" w:line="252" w:lineRule="auto"/>
         <w:ind w:left="360"/>
       </w:pPr>
-      <w:hyperlink w:history="1" w:anchor="r_31">
+      <w:hyperlink w:history="1" w:anchor="r_32">
         <w:r>
           <w:rPr>
             <w:rFonts w:ascii="Arial" w:cs="Arial" w:eastAsia="Arial" w:hAnsi="Arial"/>
@@ -676,7 +676,7 @@
         <w:spacing w:after="50" w:before="0" w:line="252" w:lineRule="auto"/>
         <w:ind w:left="360"/>
       </w:pPr>
-      <w:hyperlink w:history="1" w:anchor="r_33">
+      <w:hyperlink w:history="1" w:anchor="r_34">
         <w:r>
           <w:rPr>
             <w:rFonts w:ascii="Arial" w:cs="Arial" w:eastAsia="Arial" w:hAnsi="Arial"/>
@@ -693,7 +693,7 @@
         <w:spacing w:after="50" w:before="0" w:line="252" w:lineRule="auto"/>
         <w:ind w:left="360"/>
       </w:pPr>
-      <w:hyperlink w:history="1" w:anchor="r_35">
+      <w:hyperlink w:history="1" w:anchor="r_36">
         <w:r>
           <w:rPr>
             <w:rFonts w:ascii="Arial" w:cs="Arial" w:eastAsia="Arial" w:hAnsi="Arial"/>
@@ -710,7 +710,7 @@
         <w:spacing w:after="50" w:before="0" w:line="252" w:lineRule="auto"/>
         <w:ind w:left="360"/>
       </w:pPr>
-      <w:hyperlink w:history="1" w:anchor="r_38">
+      <w:hyperlink w:history="1" w:anchor="r_39">
         <w:r>
           <w:rPr>
             <w:rFonts w:ascii="Arial" w:cs="Arial" w:eastAsia="Arial" w:hAnsi="Arial"/>
@@ -727,7 +727,7 @@
         <w:spacing w:after="50" w:before="0" w:line="252" w:lineRule="auto"/>
         <w:ind w:left="360"/>
       </w:pPr>
-      <w:hyperlink w:history="1" w:anchor="r_40">
+      <w:hyperlink w:history="1" w:anchor="r_41">
         <w:r>
           <w:rPr>
             <w:rFonts w:ascii="Arial" w:cs="Arial" w:eastAsia="Arial" w:hAnsi="Arial"/>
@@ -744,7 +744,7 @@
         <w:spacing w:after="50" w:before="0" w:line="252" w:lineRule="auto"/>
         <w:ind w:left="360"/>
       </w:pPr>
-      <w:hyperlink w:history="1" w:anchor="r_43">
+      <w:hyperlink w:history="1" w:anchor="r_44">
         <w:r>
           <w:rPr>
             <w:rFonts w:ascii="Arial" w:cs="Arial" w:eastAsia="Arial" w:hAnsi="Arial"/>
@@ -761,7 +761,7 @@
         <w:spacing w:after="50" w:before="0" w:line="252" w:lineRule="auto"/>
         <w:ind w:left="360"/>
       </w:pPr>
-      <w:hyperlink w:history="1" w:anchor="r_45">
+      <w:hyperlink w:history="1" w:anchor="r_46">
         <w:r>
           <w:rPr>
             <w:rFonts w:ascii="Arial" w:cs="Arial" w:eastAsia="Arial" w:hAnsi="Arial"/>
@@ -778,7 +778,7 @@
         <w:spacing w:after="50" w:before="0" w:line="252" w:lineRule="auto"/>
         <w:ind w:left="360"/>
       </w:pPr>
-      <w:hyperlink w:history="1" w:anchor="r_49">
+      <w:hyperlink w:history="1" w:anchor="r_50">
         <w:r>
           <w:rPr>
             <w:rFonts w:ascii="Arial" w:cs="Arial" w:eastAsia="Arial" w:hAnsi="Arial"/>
@@ -786,7 +786,7 @@
             <w:sz w:val="20"/>
             <w:szCs w:val="20"/>
           </w:rPr>
-          <w:t xml:space="preserve">Decisões de produto pendentes</w:t>
+          <w:t xml:space="preserve">Decisões de produto</w:t>
         </w:r>
       </w:hyperlink>
     </w:p>
@@ -795,7 +795,7 @@
         <w:spacing w:after="50" w:before="0" w:line="252" w:lineRule="auto"/>
         <w:ind w:left="360"/>
       </w:pPr>
-      <w:hyperlink w:history="1" w:anchor="r_51">
+      <w:hyperlink w:history="1" w:anchor="r_57">
         <w:r>
           <w:rPr>
             <w:rFonts w:ascii="Arial" w:cs="Arial" w:eastAsia="Arial" w:hAnsi="Arial"/>
@@ -2604,6 +2604,145 @@
       <w:r>
         <w:rPr>
           <w:rFonts w:ascii="Arial" w:cs="Arial" w:eastAsia="Arial" w:hAnsi="Arial"/>
+          <w:b/>
+          <w:bCs/>
+          <w:color w:val="161F2D"/>
+          <w:sz w:val="20"/>
+          <w:szCs w:val="20"/>
+        </w:rPr>
+        <w:t xml:space="preserve">Atualização em 08/10/2026:</w:t>
+      </w:r>
+      <w:r>
+        <w:rPr>
+          <w:rFonts w:ascii="Arial" w:cs="Arial" w:eastAsia="Arial" w:hAnsi="Arial"/>
+          <w:color w:val="161F2D"/>
+          <w:sz w:val="20"/>
+          <w:szCs w:val="20"/>
+        </w:rPr>
+        <w:t xml:space="preserve"> o usuário decidiu 10 das 12. Nove foram feitas em três commits (</w:t>
+      </w:r>
+      <w:r>
+        <w:rPr>
+          <w:rFonts w:ascii="Consolas" w:cs="Consolas" w:eastAsia="Consolas" w:hAnsi="Consolas"/>
+          <w:color w:val="161F2D"/>
+          <w:sz w:val="18"/>
+          <w:szCs w:val="18"/>
+          <w:shd w:fill="EEF1F4" w:color="auto" w:val="clear"/>
+        </w:rPr>
+        <w:t xml:space="preserve">42b5598</w:t>
+      </w:r>
+      <w:r>
+        <w:rPr>
+          <w:rFonts w:ascii="Arial" w:cs="Arial" w:eastAsia="Arial" w:hAnsi="Arial"/>
+          <w:color w:val="161F2D"/>
+          <w:sz w:val="20"/>
+          <w:szCs w:val="20"/>
+        </w:rPr>
+        <w:t xml:space="preserve">, </w:t>
+      </w:r>
+      <w:r>
+        <w:rPr>
+          <w:rFonts w:ascii="Consolas" w:cs="Consolas" w:eastAsia="Consolas" w:hAnsi="Consolas"/>
+          <w:color w:val="161F2D"/>
+          <w:sz w:val="18"/>
+          <w:szCs w:val="18"/>
+          <w:shd w:fill="EEF1F4" w:color="auto" w:val="clear"/>
+        </w:rPr>
+        <w:t xml:space="preserve">09f765e</w:t>
+      </w:r>
+      <w:r>
+        <w:rPr>
+          <w:rFonts w:ascii="Arial" w:cs="Arial" w:eastAsia="Arial" w:hAnsi="Arial"/>
+          <w:color w:val="161F2D"/>
+          <w:sz w:val="20"/>
+          <w:szCs w:val="20"/>
+        </w:rPr>
+        <w:t xml:space="preserve">, </w:t>
+      </w:r>
+      <w:r>
+        <w:rPr>
+          <w:rFonts w:ascii="Consolas" w:cs="Consolas" w:eastAsia="Consolas" w:hAnsi="Consolas"/>
+          <w:color w:val="161F2D"/>
+          <w:sz w:val="18"/>
+          <w:szCs w:val="18"/>
+          <w:shd w:fill="EEF1F4" w:color="auto" w:val="clear"/>
+        </w:rPr>
+        <w:t xml:space="preserve">52d661c</w:t>
+      </w:r>
+      <w:r>
+        <w:rPr>
+          <w:rFonts w:ascii="Arial" w:cs="Arial" w:eastAsia="Arial" w:hAnsi="Arial"/>
+          <w:color w:val="161F2D"/>
+          <w:sz w:val="20"/>
+          <w:szCs w:val="20"/>
+        </w:rPr>
+        <w:t xml:space="preserve">); T12 fica como está (as telas de Perfil e Preferências virão). Continuam abertas </w:t>
+      </w:r>
+      <w:r>
+        <w:rPr>
+          <w:rFonts w:ascii="Arial" w:cs="Arial" w:eastAsia="Arial" w:hAnsi="Arial"/>
+          <w:b/>
+          <w:bCs/>
+          <w:color w:val="161F2D"/>
+          <w:sz w:val="20"/>
+          <w:szCs w:val="20"/>
+        </w:rPr>
+        <w:t xml:space="preserve">M6</w:t>
+      </w:r>
+      <w:r>
+        <w:rPr>
+          <w:rFonts w:ascii="Arial" w:cs="Arial" w:eastAsia="Arial" w:hAnsi="Arial"/>
+          <w:color w:val="161F2D"/>
+          <w:sz w:val="20"/>
+          <w:szCs w:val="20"/>
+        </w:rPr>
+        <w:t xml:space="preserve"> e </w:t>
+      </w:r>
+      <w:r>
+        <w:rPr>
+          <w:rFonts w:ascii="Arial" w:cs="Arial" w:eastAsia="Arial" w:hAnsi="Arial"/>
+          <w:b/>
+          <w:bCs/>
+          <w:color w:val="161F2D"/>
+          <w:sz w:val="20"/>
+          <w:szCs w:val="20"/>
+        </w:rPr>
+        <w:t xml:space="preserve">Aj3</w:t>
+      </w:r>
+      <w:r>
+        <w:rPr>
+          <w:rFonts w:ascii="Arial" w:cs="Arial" w:eastAsia="Arial" w:hAnsi="Arial"/>
+          <w:color w:val="161F2D"/>
+          <w:sz w:val="20"/>
+          <w:szCs w:val="20"/>
+        </w:rPr>
+        <w:t xml:space="preserve">. A decisão do Rw2 trouxe um pedido novo: o Apontamento pergunta o </w:t>
+      </w:r>
+      <w:r>
+        <w:rPr>
+          <w:rFonts w:ascii="Arial" w:cs="Arial" w:eastAsia="Arial" w:hAnsi="Arial"/>
+          <w:b/>
+          <w:bCs/>
+          <w:color w:val="161F2D"/>
+          <w:sz w:val="20"/>
+          <w:szCs w:val="20"/>
+        </w:rPr>
+        <w:t xml:space="preserve">motivo do retrabalho</w:t>
+      </w:r>
+      <w:r>
+        <w:rPr>
+          <w:rFonts w:ascii="Arial" w:cs="Arial" w:eastAsia="Arial" w:hAnsi="Arial"/>
+          <w:color w:val="161F2D"/>
+          <w:sz w:val="20"/>
+          <w:szCs w:val="20"/>
+        </w:rPr>
+        <w:t xml:space="preserve">, e ele alimenta o gráfico "Motivos de retrabalho" (veja o fim do relatório).</w:t>
+      </w:r>
+    </w:p>
+    <w:p>
+      <w:r>
+        <w:rPr>
+          <w:rFonts w:ascii="Arial" w:cs="Arial" w:eastAsia="Arial" w:hAnsi="Arial"/>
           <w:color w:val="161F2D"/>
           <w:sz w:val="20"/>
           <w:szCs w:val="20"/>
@@ -3705,7 +3844,7 @@
         <w:keepNext/>
         <w:keepLines/>
       </w:pPr>
-      <w:bookmarkStart w:name="r_16" w:id="4"/>
+      <w:bookmarkStart w:name="r_17" w:id="4"/>
       <w:r>
         <w:rPr>
           <w:rFonts w:ascii="Arial" w:cs="Arial" w:eastAsia="Arial" w:hAnsi="Arial"/>
@@ -7529,27 +7668,27 @@
         <w:tc>
           <w:tcPr>
             <w:tcW w:type="dxa" w:w="1164"/>
-            <w:shd w:fill="F3EDFD" w:color="auto" w:val="clear"/>
-            <w:tcMar>
-              <w:top w:type="dxa" w:w="60"/>
-              <w:left w:type="dxa" w:w="80"/>
-              <w:bottom w:type="dxa" w:w="60"/>
-              <w:right w:type="dxa" w:w="80"/>
-            </w:tcMar>
-            <w:vAlign w:val="top"/>
-          </w:tcPr>
-          <w:p>
-            <w:pPr>
-              <w:spacing w:after="0" w:before="0" w:line="240" w:lineRule="auto"/>
-            </w:pPr>
-            <w:r>
-              <w:rPr>
-                <w:rFonts w:ascii="Arial" w:cs="Arial" w:eastAsia="Arial" w:hAnsi="Arial"/>
-                <w:color w:val="5D36A1"/>
-                <w:sz w:val="15"/>
-                <w:szCs w:val="15"/>
-              </w:rPr>
-              <w:t xml:space="preserve">Aguardando decisão</w:t>
+            <w:shd w:fill="FFF1D1" w:color="auto" w:val="clear"/>
+            <w:tcMar>
+              <w:top w:type="dxa" w:w="60"/>
+              <w:left w:type="dxa" w:w="80"/>
+              <w:bottom w:type="dxa" w:w="60"/>
+              <w:right w:type="dxa" w:w="80"/>
+            </w:tcMar>
+            <w:vAlign w:val="top"/>
+          </w:tcPr>
+          <w:p>
+            <w:pPr>
+              <w:spacing w:after="0" w:before="0" w:line="240" w:lineRule="auto"/>
+            </w:pPr>
+            <w:r>
+              <w:rPr>
+                <w:rFonts w:ascii="Arial" w:cs="Arial" w:eastAsia="Arial" w:hAnsi="Arial"/>
+                <w:color w:val="914808"/>
+                <w:sz w:val="15"/>
+                <w:szCs w:val="15"/>
+              </w:rPr>
+              <w:t xml:space="preserve">Adiado: os dois itens ficam, as telas virão depois</w:t>
             </w:r>
           </w:p>
         </w:tc>
@@ -9534,7 +9673,7 @@
         <w:keepNext/>
         <w:keepLines/>
       </w:pPr>
-      <w:bookmarkStart w:name="r_18" w:id="5"/>
+      <w:bookmarkStart w:name="r_19" w:id="5"/>
       <w:r>
         <w:rPr>
           <w:rFonts w:ascii="Arial" w:cs="Arial" w:eastAsia="Arial" w:hAnsi="Arial"/>
@@ -10692,27 +10831,45 @@
         <w:tc>
           <w:tcPr>
             <w:tcW w:type="dxa" w:w="1164"/>
-            <w:shd w:fill="F3EDFD" w:color="auto" w:val="clear"/>
-            <w:tcMar>
-              <w:top w:type="dxa" w:w="60"/>
-              <w:left w:type="dxa" w:w="80"/>
-              <w:bottom w:type="dxa" w:w="60"/>
-              <w:right w:type="dxa" w:w="80"/>
-            </w:tcMar>
-            <w:vAlign w:val="top"/>
-          </w:tcPr>
-          <w:p>
-            <w:pPr>
-              <w:spacing w:after="0" w:before="0" w:line="240" w:lineRule="auto"/>
-            </w:pPr>
-            <w:r>
-              <w:rPr>
-                <w:rFonts w:ascii="Arial" w:cs="Arial" w:eastAsia="Arial" w:hAnsi="Arial"/>
-                <w:color w:val="5D36A1"/>
-                <w:sz w:val="15"/>
-                <w:szCs w:val="15"/>
-              </w:rPr>
-              <w:t xml:space="preserve">Aguardando decisão</w:t>
+            <w:shd w:fill="E7F8ED" w:color="auto" w:val="clear"/>
+            <w:tcMar>
+              <w:top w:type="dxa" w:w="60"/>
+              <w:left w:type="dxa" w:w="80"/>
+              <w:bottom w:type="dxa" w:w="60"/>
+              <w:right w:type="dxa" w:w="80"/>
+            </w:tcMar>
+            <w:vAlign w:val="top"/>
+          </w:tcPr>
+          <w:p>
+            <w:pPr>
+              <w:spacing w:after="0" w:before="0" w:line="240" w:lineRule="auto"/>
+            </w:pPr>
+            <w:r>
+              <w:rPr>
+                <w:rFonts w:ascii="Arial" w:cs="Arial" w:eastAsia="Arial" w:hAnsi="Arial"/>
+                <w:color w:val="126836"/>
+                <w:sz w:val="15"/>
+                <w:szCs w:val="15"/>
+              </w:rPr>
+              <w:t xml:space="preserve">Corrigido (</w:t>
+            </w:r>
+            <w:r>
+              <w:rPr>
+                <w:rFonts w:ascii="Consolas" w:cs="Consolas" w:eastAsia="Consolas" w:hAnsi="Consolas"/>
+                <w:color w:val="126836"/>
+                <w:sz w:val="14"/>
+                <w:szCs w:val="14"/>
+              </w:rPr>
+              <w:t xml:space="preserve">42b5598</w:t>
+            </w:r>
+            <w:r>
+              <w:rPr>
+                <w:rFonts w:ascii="Arial" w:cs="Arial" w:eastAsia="Arial" w:hAnsi="Arial"/>
+                <w:color w:val="126836"/>
+                <w:sz w:val="15"/>
+                <w:szCs w:val="15"/>
+              </w:rPr>
+              <w:t xml:space="preserve">)</w:t>
             </w:r>
           </w:p>
         </w:tc>
@@ -10923,27 +11080,45 @@
         <w:tc>
           <w:tcPr>
             <w:tcW w:type="dxa" w:w="1164"/>
-            <w:shd w:fill="F3EDFD" w:color="auto" w:val="clear"/>
-            <w:tcMar>
-              <w:top w:type="dxa" w:w="60"/>
-              <w:left w:type="dxa" w:w="80"/>
-              <w:bottom w:type="dxa" w:w="60"/>
-              <w:right w:type="dxa" w:w="80"/>
-            </w:tcMar>
-            <w:vAlign w:val="top"/>
-          </w:tcPr>
-          <w:p>
-            <w:pPr>
-              <w:spacing w:after="0" w:before="0" w:line="240" w:lineRule="auto"/>
-            </w:pPr>
-            <w:r>
-              <w:rPr>
-                <w:rFonts w:ascii="Arial" w:cs="Arial" w:eastAsia="Arial" w:hAnsi="Arial"/>
-                <w:color w:val="5D36A1"/>
-                <w:sz w:val="15"/>
-                <w:szCs w:val="15"/>
-              </w:rPr>
-              <w:t xml:space="preserve">Aguardando decisão</w:t>
+            <w:shd w:fill="E7F8ED" w:color="auto" w:val="clear"/>
+            <w:tcMar>
+              <w:top w:type="dxa" w:w="60"/>
+              <w:left w:type="dxa" w:w="80"/>
+              <w:bottom w:type="dxa" w:w="60"/>
+              <w:right w:type="dxa" w:w="80"/>
+            </w:tcMar>
+            <w:vAlign w:val="top"/>
+          </w:tcPr>
+          <w:p>
+            <w:pPr>
+              <w:spacing w:after="0" w:before="0" w:line="240" w:lineRule="auto"/>
+            </w:pPr>
+            <w:r>
+              <w:rPr>
+                <w:rFonts w:ascii="Arial" w:cs="Arial" w:eastAsia="Arial" w:hAnsi="Arial"/>
+                <w:color w:val="126836"/>
+                <w:sz w:val="15"/>
+                <w:szCs w:val="15"/>
+              </w:rPr>
+              <w:t xml:space="preserve">Corrigido (</w:t>
+            </w:r>
+            <w:r>
+              <w:rPr>
+                <w:rFonts w:ascii="Consolas" w:cs="Consolas" w:eastAsia="Consolas" w:hAnsi="Consolas"/>
+                <w:color w:val="126836"/>
+                <w:sz w:val="14"/>
+                <w:szCs w:val="14"/>
+              </w:rPr>
+              <w:t xml:space="preserve">42b5598</w:t>
+            </w:r>
+            <w:r>
+              <w:rPr>
+                <w:rFonts w:ascii="Arial" w:cs="Arial" w:eastAsia="Arial" w:hAnsi="Arial"/>
+                <w:color w:val="126836"/>
+                <w:sz w:val="15"/>
+                <w:szCs w:val="15"/>
+              </w:rPr>
+              <w:t xml:space="preserve">)</w:t>
             </w:r>
           </w:p>
         </w:tc>
@@ -11172,27 +11347,45 @@
         <w:tc>
           <w:tcPr>
             <w:tcW w:type="dxa" w:w="1164"/>
-            <w:shd w:fill="F3EDFD" w:color="auto" w:val="clear"/>
-            <w:tcMar>
-              <w:top w:type="dxa" w:w="60"/>
-              <w:left w:type="dxa" w:w="80"/>
-              <w:bottom w:type="dxa" w:w="60"/>
-              <w:right w:type="dxa" w:w="80"/>
-            </w:tcMar>
-            <w:vAlign w:val="top"/>
-          </w:tcPr>
-          <w:p>
-            <w:pPr>
-              <w:spacing w:after="0" w:before="0" w:line="240" w:lineRule="auto"/>
-            </w:pPr>
-            <w:r>
-              <w:rPr>
-                <w:rFonts w:ascii="Arial" w:cs="Arial" w:eastAsia="Arial" w:hAnsi="Arial"/>
-                <w:color w:val="5D36A1"/>
-                <w:sz w:val="15"/>
-                <w:szCs w:val="15"/>
-              </w:rPr>
-              <w:t xml:space="preserve">Aguardando decisão</w:t>
+            <w:shd w:fill="E7F8ED" w:color="auto" w:val="clear"/>
+            <w:tcMar>
+              <w:top w:type="dxa" w:w="60"/>
+              <w:left w:type="dxa" w:w="80"/>
+              <w:bottom w:type="dxa" w:w="60"/>
+              <w:right w:type="dxa" w:w="80"/>
+            </w:tcMar>
+            <w:vAlign w:val="top"/>
+          </w:tcPr>
+          <w:p>
+            <w:pPr>
+              <w:spacing w:after="0" w:before="0" w:line="240" w:lineRule="auto"/>
+            </w:pPr>
+            <w:r>
+              <w:rPr>
+                <w:rFonts w:ascii="Arial" w:cs="Arial" w:eastAsia="Arial" w:hAnsi="Arial"/>
+                <w:color w:val="126836"/>
+                <w:sz w:val="15"/>
+                <w:szCs w:val="15"/>
+              </w:rPr>
+              <w:t xml:space="preserve">Corrigido (</w:t>
+            </w:r>
+            <w:r>
+              <w:rPr>
+                <w:rFonts w:ascii="Consolas" w:cs="Consolas" w:eastAsia="Consolas" w:hAnsi="Consolas"/>
+                <w:color w:val="126836"/>
+                <w:sz w:val="14"/>
+                <w:szCs w:val="14"/>
+              </w:rPr>
+              <w:t xml:space="preserve">42b5598</w:t>
+            </w:r>
+            <w:r>
+              <w:rPr>
+                <w:rFonts w:ascii="Arial" w:cs="Arial" w:eastAsia="Arial" w:hAnsi="Arial"/>
+                <w:color w:val="126836"/>
+                <w:sz w:val="15"/>
+                <w:szCs w:val="15"/>
+              </w:rPr>
+              <w:t xml:space="preserve">)</w:t>
             </w:r>
           </w:p>
         </w:tc>
@@ -11670,27 +11863,45 @@
         <w:tc>
           <w:tcPr>
             <w:tcW w:type="dxa" w:w="1164"/>
-            <w:shd w:fill="F3EDFD" w:color="auto" w:val="clear"/>
-            <w:tcMar>
-              <w:top w:type="dxa" w:w="60"/>
-              <w:left w:type="dxa" w:w="80"/>
-              <w:bottom w:type="dxa" w:w="60"/>
-              <w:right w:type="dxa" w:w="80"/>
-            </w:tcMar>
-            <w:vAlign w:val="top"/>
-          </w:tcPr>
-          <w:p>
-            <w:pPr>
-              <w:spacing w:after="0" w:before="0" w:line="240" w:lineRule="auto"/>
-            </w:pPr>
-            <w:r>
-              <w:rPr>
-                <w:rFonts w:ascii="Arial" w:cs="Arial" w:eastAsia="Arial" w:hAnsi="Arial"/>
-                <w:color w:val="5D36A1"/>
-                <w:sz w:val="15"/>
-                <w:szCs w:val="15"/>
-              </w:rPr>
-              <w:t xml:space="preserve">Aguardando decisão</w:t>
+            <w:shd w:fill="E7F8ED" w:color="auto" w:val="clear"/>
+            <w:tcMar>
+              <w:top w:type="dxa" w:w="60"/>
+              <w:left w:type="dxa" w:w="80"/>
+              <w:bottom w:type="dxa" w:w="60"/>
+              <w:right w:type="dxa" w:w="80"/>
+            </w:tcMar>
+            <w:vAlign w:val="top"/>
+          </w:tcPr>
+          <w:p>
+            <w:pPr>
+              <w:spacing w:after="0" w:before="0" w:line="240" w:lineRule="auto"/>
+            </w:pPr>
+            <w:r>
+              <w:rPr>
+                <w:rFonts w:ascii="Arial" w:cs="Arial" w:eastAsia="Arial" w:hAnsi="Arial"/>
+                <w:color w:val="126836"/>
+                <w:sz w:val="15"/>
+                <w:szCs w:val="15"/>
+              </w:rPr>
+              <w:t xml:space="preserve">Corrigido (</w:t>
+            </w:r>
+            <w:r>
+              <w:rPr>
+                <w:rFonts w:ascii="Consolas" w:cs="Consolas" w:eastAsia="Consolas" w:hAnsi="Consolas"/>
+                <w:color w:val="126836"/>
+                <w:sz w:val="14"/>
+                <w:szCs w:val="14"/>
+              </w:rPr>
+              <w:t xml:space="preserve">42b5598</w:t>
+            </w:r>
+            <w:r>
+              <w:rPr>
+                <w:rFonts w:ascii="Arial" w:cs="Arial" w:eastAsia="Arial" w:hAnsi="Arial"/>
+                <w:color w:val="126836"/>
+                <w:sz w:val="15"/>
+                <w:szCs w:val="15"/>
+              </w:rPr>
+              <w:t xml:space="preserve">)</w:t>
             </w:r>
           </w:p>
         </w:tc>
@@ -13291,7 +13502,7 @@
         <w:keepNext/>
         <w:keepLines/>
       </w:pPr>
-      <w:bookmarkStart w:name="r_20" w:id="6"/>
+      <w:bookmarkStart w:name="r_21" w:id="6"/>
       <w:r>
         <w:rPr>
           <w:rFonts w:ascii="Arial" w:cs="Arial" w:eastAsia="Arial" w:hAnsi="Arial"/>
@@ -13817,27 +14028,45 @@
         <w:tc>
           <w:tcPr>
             <w:tcW w:type="dxa" w:w="1164"/>
-            <w:shd w:fill="F3EDFD" w:color="auto" w:val="clear"/>
-            <w:tcMar>
-              <w:top w:type="dxa" w:w="60"/>
-              <w:left w:type="dxa" w:w="80"/>
-              <w:bottom w:type="dxa" w:w="60"/>
-              <w:right w:type="dxa" w:w="80"/>
-            </w:tcMar>
-            <w:vAlign w:val="top"/>
-          </w:tcPr>
-          <w:p>
-            <w:pPr>
-              <w:spacing w:after="0" w:before="0" w:line="240" w:lineRule="auto"/>
-            </w:pPr>
-            <w:r>
-              <w:rPr>
-                <w:rFonts w:ascii="Arial" w:cs="Arial" w:eastAsia="Arial" w:hAnsi="Arial"/>
-                <w:color w:val="5D36A1"/>
-                <w:sz w:val="15"/>
-                <w:szCs w:val="15"/>
-              </w:rPr>
-              <w:t xml:space="preserve">Aguardando decisão</w:t>
+            <w:shd w:fill="E7F8ED" w:color="auto" w:val="clear"/>
+            <w:tcMar>
+              <w:top w:type="dxa" w:w="60"/>
+              <w:left w:type="dxa" w:w="80"/>
+              <w:bottom w:type="dxa" w:w="60"/>
+              <w:right w:type="dxa" w:w="80"/>
+            </w:tcMar>
+            <w:vAlign w:val="top"/>
+          </w:tcPr>
+          <w:p>
+            <w:pPr>
+              <w:spacing w:after="0" w:before="0" w:line="240" w:lineRule="auto"/>
+            </w:pPr>
+            <w:r>
+              <w:rPr>
+                <w:rFonts w:ascii="Arial" w:cs="Arial" w:eastAsia="Arial" w:hAnsi="Arial"/>
+                <w:color w:val="126836"/>
+                <w:sz w:val="15"/>
+                <w:szCs w:val="15"/>
+              </w:rPr>
+              <w:t xml:space="preserve">Corrigido (</w:t>
+            </w:r>
+            <w:r>
+              <w:rPr>
+                <w:rFonts w:ascii="Consolas" w:cs="Consolas" w:eastAsia="Consolas" w:hAnsi="Consolas"/>
+                <w:color w:val="126836"/>
+                <w:sz w:val="14"/>
+                <w:szCs w:val="14"/>
+              </w:rPr>
+              <w:t xml:space="preserve">09f765e</w:t>
+            </w:r>
+            <w:r>
+              <w:rPr>
+                <w:rFonts w:ascii="Arial" w:cs="Arial" w:eastAsia="Arial" w:hAnsi="Arial"/>
+                <w:color w:val="126836"/>
+                <w:sz w:val="15"/>
+                <w:szCs w:val="15"/>
+              </w:rPr>
+              <w:t xml:space="preserve">)</w:t>
             </w:r>
           </w:p>
         </w:tc>
@@ -14288,27 +14517,45 @@
         <w:tc>
           <w:tcPr>
             <w:tcW w:type="dxa" w:w="1164"/>
-            <w:shd w:fill="F3EDFD" w:color="auto" w:val="clear"/>
-            <w:tcMar>
-              <w:top w:type="dxa" w:w="60"/>
-              <w:left w:type="dxa" w:w="80"/>
-              <w:bottom w:type="dxa" w:w="60"/>
-              <w:right w:type="dxa" w:w="80"/>
-            </w:tcMar>
-            <w:vAlign w:val="top"/>
-          </w:tcPr>
-          <w:p>
-            <w:pPr>
-              <w:spacing w:after="0" w:before="0" w:line="240" w:lineRule="auto"/>
-            </w:pPr>
-            <w:r>
-              <w:rPr>
-                <w:rFonts w:ascii="Arial" w:cs="Arial" w:eastAsia="Arial" w:hAnsi="Arial"/>
-                <w:color w:val="5D36A1"/>
-                <w:sz w:val="15"/>
-                <w:szCs w:val="15"/>
-              </w:rPr>
-              <w:t xml:space="preserve">Aguardando decisão</w:t>
+            <w:shd w:fill="E7F8ED" w:color="auto" w:val="clear"/>
+            <w:tcMar>
+              <w:top w:type="dxa" w:w="60"/>
+              <w:left w:type="dxa" w:w="80"/>
+              <w:bottom w:type="dxa" w:w="60"/>
+              <w:right w:type="dxa" w:w="80"/>
+            </w:tcMar>
+            <w:vAlign w:val="top"/>
+          </w:tcPr>
+          <w:p>
+            <w:pPr>
+              <w:spacing w:after="0" w:before="0" w:line="240" w:lineRule="auto"/>
+            </w:pPr>
+            <w:r>
+              <w:rPr>
+                <w:rFonts w:ascii="Arial" w:cs="Arial" w:eastAsia="Arial" w:hAnsi="Arial"/>
+                <w:color w:val="126836"/>
+                <w:sz w:val="15"/>
+                <w:szCs w:val="15"/>
+              </w:rPr>
+              <w:t xml:space="preserve">Corrigido (</w:t>
+            </w:r>
+            <w:r>
+              <w:rPr>
+                <w:rFonts w:ascii="Consolas" w:cs="Consolas" w:eastAsia="Consolas" w:hAnsi="Consolas"/>
+                <w:color w:val="126836"/>
+                <w:sz w:val="14"/>
+                <w:szCs w:val="14"/>
+              </w:rPr>
+              <w:t xml:space="preserve">09f765e</w:t>
+            </w:r>
+            <w:r>
+              <w:rPr>
+                <w:rFonts w:ascii="Arial" w:cs="Arial" w:eastAsia="Arial" w:hAnsi="Arial"/>
+                <w:color w:val="126836"/>
+                <w:sz w:val="15"/>
+                <w:szCs w:val="15"/>
+              </w:rPr>
+              <w:t xml:space="preserve">)</w:t>
             </w:r>
           </w:p>
         </w:tc>
@@ -14325,7 +14572,7 @@
         <w:keepNext/>
         <w:keepLines/>
       </w:pPr>
-      <w:bookmarkStart w:name="r_22" w:id="7"/>
+      <w:bookmarkStart w:name="r_23" w:id="7"/>
       <w:r>
         <w:rPr>
           <w:rFonts w:ascii="Arial" w:cs="Arial" w:eastAsia="Arial" w:hAnsi="Arial"/>
@@ -15404,7 +15651,7 @@
         <w:keepNext/>
         <w:keepLines/>
       </w:pPr>
-      <w:bookmarkStart w:name="r_24" w:id="8"/>
+      <w:bookmarkStart w:name="r_25" w:id="8"/>
       <w:r>
         <w:rPr>
           <w:rFonts w:ascii="Arial" w:cs="Arial" w:eastAsia="Arial" w:hAnsi="Arial"/>
@@ -16512,7 +16759,7 @@
         <w:keepNext/>
         <w:keepLines/>
       </w:pPr>
-      <w:bookmarkStart w:name="r_26" w:id="9"/>
+      <w:bookmarkStart w:name="r_27" w:id="9"/>
       <w:r>
         <w:rPr>
           <w:rFonts w:ascii="Arial" w:cs="Arial" w:eastAsia="Arial" w:hAnsi="Arial"/>
@@ -17020,27 +17267,45 @@
         <w:tc>
           <w:tcPr>
             <w:tcW w:type="dxa" w:w="1164"/>
-            <w:shd w:fill="F3EDFD" w:color="auto" w:val="clear"/>
-            <w:tcMar>
-              <w:top w:type="dxa" w:w="60"/>
-              <w:left w:type="dxa" w:w="80"/>
-              <w:bottom w:type="dxa" w:w="60"/>
-              <w:right w:type="dxa" w:w="80"/>
-            </w:tcMar>
-            <w:vAlign w:val="top"/>
-          </w:tcPr>
-          <w:p>
-            <w:pPr>
-              <w:spacing w:after="0" w:before="0" w:line="240" w:lineRule="auto"/>
-            </w:pPr>
-            <w:r>
-              <w:rPr>
-                <w:rFonts w:ascii="Arial" w:cs="Arial" w:eastAsia="Arial" w:hAnsi="Arial"/>
-                <w:color w:val="5D36A1"/>
-                <w:sz w:val="15"/>
-                <w:szCs w:val="15"/>
-              </w:rPr>
-              <w:t xml:space="preserve">Aguardando decisão</w:t>
+            <w:shd w:fill="E7F8ED" w:color="auto" w:val="clear"/>
+            <w:tcMar>
+              <w:top w:type="dxa" w:w="60"/>
+              <w:left w:type="dxa" w:w="80"/>
+              <w:bottom w:type="dxa" w:w="60"/>
+              <w:right w:type="dxa" w:w="80"/>
+            </w:tcMar>
+            <w:vAlign w:val="top"/>
+          </w:tcPr>
+          <w:p>
+            <w:pPr>
+              <w:spacing w:after="0" w:before="0" w:line="240" w:lineRule="auto"/>
+            </w:pPr>
+            <w:r>
+              <w:rPr>
+                <w:rFonts w:ascii="Arial" w:cs="Arial" w:eastAsia="Arial" w:hAnsi="Arial"/>
+                <w:color w:val="126836"/>
+                <w:sz w:val="15"/>
+                <w:szCs w:val="15"/>
+              </w:rPr>
+              <w:t xml:space="preserve">Corrigido (</w:t>
+            </w:r>
+            <w:r>
+              <w:rPr>
+                <w:rFonts w:ascii="Consolas" w:cs="Consolas" w:eastAsia="Consolas" w:hAnsi="Consolas"/>
+                <w:color w:val="126836"/>
+                <w:sz w:val="14"/>
+                <w:szCs w:val="14"/>
+              </w:rPr>
+              <w:t xml:space="preserve">42b5598</w:t>
+            </w:r>
+            <w:r>
+              <w:rPr>
+                <w:rFonts w:ascii="Arial" w:cs="Arial" w:eastAsia="Arial" w:hAnsi="Arial"/>
+                <w:color w:val="126836"/>
+                <w:sz w:val="15"/>
+                <w:szCs w:val="15"/>
+              </w:rPr>
+              <w:t xml:space="preserve">): fórmula retirada</w:t>
             </w:r>
           </w:p>
         </w:tc>
@@ -17068,7 +17333,7 @@
         <w:keepNext/>
         <w:keepLines/>
       </w:pPr>
-      <w:bookmarkStart w:name="r_29" w:id="10"/>
+      <w:bookmarkStart w:name="r_30" w:id="10"/>
       <w:r>
         <w:rPr>
           <w:rFonts w:ascii="Arial" w:cs="Arial" w:eastAsia="Arial" w:hAnsi="Arial"/>
@@ -17094,7 +17359,7 @@
         <w:keepNext/>
         <w:keepLines/>
       </w:pPr>
-      <w:bookmarkStart w:name="r_31" w:id="11"/>
+      <w:bookmarkStart w:name="r_32" w:id="11"/>
       <w:r>
         <w:rPr>
           <w:rFonts w:ascii="Arial" w:cs="Arial" w:eastAsia="Arial" w:hAnsi="Arial"/>
@@ -17869,27 +18134,45 @@
         <w:tc>
           <w:tcPr>
             <w:tcW w:type="dxa" w:w="1164"/>
-            <w:shd w:fill="F3EDFD" w:color="auto" w:val="clear"/>
-            <w:tcMar>
-              <w:top w:type="dxa" w:w="60"/>
-              <w:left w:type="dxa" w:w="80"/>
-              <w:bottom w:type="dxa" w:w="60"/>
-              <w:right w:type="dxa" w:w="80"/>
-            </w:tcMar>
-            <w:vAlign w:val="top"/>
-          </w:tcPr>
-          <w:p>
-            <w:pPr>
-              <w:spacing w:after="0" w:before="0" w:line="240" w:lineRule="auto"/>
-            </w:pPr>
-            <w:r>
-              <w:rPr>
-                <w:rFonts w:ascii="Arial" w:cs="Arial" w:eastAsia="Arial" w:hAnsi="Arial"/>
-                <w:color w:val="5D36A1"/>
-                <w:sz w:val="15"/>
-                <w:szCs w:val="15"/>
-              </w:rPr>
-              <w:t xml:space="preserve">Aguardando decisão</w:t>
+            <w:shd w:fill="E7F8ED" w:color="auto" w:val="clear"/>
+            <w:tcMar>
+              <w:top w:type="dxa" w:w="60"/>
+              <w:left w:type="dxa" w:w="80"/>
+              <w:bottom w:type="dxa" w:w="60"/>
+              <w:right w:type="dxa" w:w="80"/>
+            </w:tcMar>
+            <w:vAlign w:val="top"/>
+          </w:tcPr>
+          <w:p>
+            <w:pPr>
+              <w:spacing w:after="0" w:before="0" w:line="240" w:lineRule="auto"/>
+            </w:pPr>
+            <w:r>
+              <w:rPr>
+                <w:rFonts w:ascii="Arial" w:cs="Arial" w:eastAsia="Arial" w:hAnsi="Arial"/>
+                <w:color w:val="126836"/>
+                <w:sz w:val="15"/>
+                <w:szCs w:val="15"/>
+              </w:rPr>
+              <w:t xml:space="preserve">Corrigido (</w:t>
+            </w:r>
+            <w:r>
+              <w:rPr>
+                <w:rFonts w:ascii="Consolas" w:cs="Consolas" w:eastAsia="Consolas" w:hAnsi="Consolas"/>
+                <w:color w:val="126836"/>
+                <w:sz w:val="14"/>
+                <w:szCs w:val="14"/>
+              </w:rPr>
+              <w:t xml:space="preserve">42b5598</w:t>
+            </w:r>
+            <w:r>
+              <w:rPr>
+                <w:rFonts w:ascii="Arial" w:cs="Arial" w:eastAsia="Arial" w:hAnsi="Arial"/>
+                <w:color w:val="126836"/>
+                <w:sz w:val="15"/>
+                <w:szCs w:val="15"/>
+              </w:rPr>
+              <w:t xml:space="preserve">)</w:t>
             </w:r>
           </w:p>
         </w:tc>
@@ -17906,7 +18189,7 @@
         <w:keepNext/>
         <w:keepLines/>
       </w:pPr>
-      <w:bookmarkStart w:name="r_33" w:id="12"/>
+      <w:bookmarkStart w:name="r_34" w:id="12"/>
       <w:r>
         <w:rPr>
           <w:rFonts w:ascii="Arial" w:cs="Arial" w:eastAsia="Arial" w:hAnsi="Arial"/>
@@ -19548,7 +19831,7 @@
         <w:keepNext/>
         <w:keepLines/>
       </w:pPr>
-      <w:bookmarkStart w:name="r_35" w:id="13"/>
+      <w:bookmarkStart w:name="r_36" w:id="13"/>
       <w:r>
         <w:rPr>
           <w:rFonts w:ascii="Arial" w:cs="Arial" w:eastAsia="Arial" w:hAnsi="Arial"/>
@@ -21152,7 +21435,7 @@
         <w:keepNext/>
         <w:keepLines/>
       </w:pPr>
-      <w:bookmarkStart w:name="r_38" w:id="14"/>
+      <w:bookmarkStart w:name="r_39" w:id="14"/>
       <w:r>
         <w:rPr>
           <w:rFonts w:ascii="Arial" w:cs="Arial" w:eastAsia="Arial" w:hAnsi="Arial"/>
@@ -21965,7 +22248,25 @@
                 <w:sz w:val="15"/>
                 <w:szCs w:val="15"/>
               </w:rPr>
-              <w:t xml:space="preserve">); filtro aguarda decisão</w:t>
+              <w:t xml:space="preserve">) e o filtro (</w:t>
+            </w:r>
+            <w:r>
+              <w:rPr>
+                <w:rFonts w:ascii="Consolas" w:cs="Consolas" w:eastAsia="Consolas" w:hAnsi="Consolas"/>
+                <w:color w:val="126836"/>
+                <w:sz w:val="14"/>
+                <w:szCs w:val="14"/>
+              </w:rPr>
+              <w:t xml:space="preserve">52d661c</w:t>
+            </w:r>
+            <w:r>
+              <w:rPr>
+                <w:rFonts w:ascii="Arial" w:cs="Arial" w:eastAsia="Arial" w:hAnsi="Arial"/>
+                <w:color w:val="126836"/>
+                <w:sz w:val="15"/>
+                <w:szCs w:val="15"/>
+              </w:rPr>
+              <w:t xml:space="preserve">)</w:t>
             </w:r>
           </w:p>
         </w:tc>
@@ -22723,7 +23024,7 @@
         <w:keepNext/>
         <w:keepLines/>
       </w:pPr>
-      <w:bookmarkStart w:name="r_40" w:id="15"/>
+      <w:bookmarkStart w:name="r_41" w:id="15"/>
       <w:r>
         <w:rPr>
           <w:rFonts w:ascii="Arial" w:cs="Arial" w:eastAsia="Arial" w:hAnsi="Arial"/>
@@ -23315,7 +23616,7 @@
         <w:keepNext/>
         <w:keepLines/>
       </w:pPr>
-      <w:bookmarkStart w:name="r_43" w:id="16"/>
+      <w:bookmarkStart w:name="r_44" w:id="16"/>
       <w:r>
         <w:rPr>
           <w:rFonts w:ascii="Arial" w:cs="Arial" w:eastAsia="Arial" w:hAnsi="Arial"/>
@@ -24819,27 +25120,45 @@
         <w:tc>
           <w:tcPr>
             <w:tcW w:type="dxa" w:w="1164"/>
-            <w:shd w:fill="F3EDFD" w:color="auto" w:val="clear"/>
-            <w:tcMar>
-              <w:top w:type="dxa" w:w="60"/>
-              <w:left w:type="dxa" w:w="80"/>
-              <w:bottom w:type="dxa" w:w="60"/>
-              <w:right w:type="dxa" w:w="80"/>
-            </w:tcMar>
-            <w:vAlign w:val="top"/>
-          </w:tcPr>
-          <w:p>
-            <w:pPr>
-              <w:spacing w:after="0" w:before="0" w:line="240" w:lineRule="auto"/>
-            </w:pPr>
-            <w:r>
-              <w:rPr>
-                <w:rFonts w:ascii="Arial" w:cs="Arial" w:eastAsia="Arial" w:hAnsi="Arial"/>
-                <w:color w:val="5D36A1"/>
-                <w:sz w:val="15"/>
-                <w:szCs w:val="15"/>
-              </w:rPr>
-              <w:t xml:space="preserve">Aguardando decisão</w:t>
+            <w:shd w:fill="E7F8ED" w:color="auto" w:val="clear"/>
+            <w:tcMar>
+              <w:top w:type="dxa" w:w="60"/>
+              <w:left w:type="dxa" w:w="80"/>
+              <w:bottom w:type="dxa" w:w="60"/>
+              <w:right w:type="dxa" w:w="80"/>
+            </w:tcMar>
+            <w:vAlign w:val="top"/>
+          </w:tcPr>
+          <w:p>
+            <w:pPr>
+              <w:spacing w:after="0" w:before="0" w:line="240" w:lineRule="auto"/>
+            </w:pPr>
+            <w:r>
+              <w:rPr>
+                <w:rFonts w:ascii="Arial" w:cs="Arial" w:eastAsia="Arial" w:hAnsi="Arial"/>
+                <w:color w:val="126836"/>
+                <w:sz w:val="15"/>
+                <w:szCs w:val="15"/>
+              </w:rPr>
+              <w:t xml:space="preserve">Corrigido (</w:t>
+            </w:r>
+            <w:r>
+              <w:rPr>
+                <w:rFonts w:ascii="Consolas" w:cs="Consolas" w:eastAsia="Consolas" w:hAnsi="Consolas"/>
+                <w:color w:val="126836"/>
+                <w:sz w:val="14"/>
+                <w:szCs w:val="14"/>
+              </w:rPr>
+              <w:t xml:space="preserve">42b5598</w:t>
+            </w:r>
+            <w:r>
+              <w:rPr>
+                <w:rFonts w:ascii="Arial" w:cs="Arial" w:eastAsia="Arial" w:hAnsi="Arial"/>
+                <w:color w:val="126836"/>
+                <w:sz w:val="15"/>
+                <w:szCs w:val="15"/>
+              </w:rPr>
+              <w:t xml:space="preserve">): botão retirado</w:t>
             </w:r>
           </w:p>
         </w:tc>
@@ -24856,7 +25175,7 @@
         <w:keepNext/>
         <w:keepLines/>
       </w:pPr>
-      <w:bookmarkStart w:name="r_45" w:id="17"/>
+      <w:bookmarkStart w:name="r_46" w:id="17"/>
       <w:r>
         <w:rPr>
           <w:rFonts w:ascii="Arial" w:cs="Arial" w:eastAsia="Arial" w:hAnsi="Arial"/>
@@ -25477,35 +25796,19 @@
         <w:keepNext/>
         <w:keepLines/>
       </w:pPr>
-      <w:bookmarkStart w:name="r_49" w:id="18"/>
+      <w:bookmarkStart w:name="r_50" w:id="18"/>
       <w:r>
         <w:rPr>
           <w:rFonts w:ascii="Arial" w:cs="Arial" w:eastAsia="Arial" w:hAnsi="Arial"/>
         </w:rPr>
-        <w:t xml:space="preserve">Decisões de produto pendentes</w:t>
+        <w:t xml:space="preserve">Decisões de produto</w:t>
       </w:r>
       <w:bookmarkEnd w:id="18"/>
     </w:p>
     <w:p>
       <w:pPr>
-        <w:pStyle w:val="ListParagraph"/>
-        <w:numPr>
-          <w:ilvl w:val="0"/>
-          <w:numId w:val="3"/>
-        </w:numPr>
-        <w:spacing w:after="80"/>
+        <w:keepNext/>
       </w:pPr>
-      <w:r>
-        <w:rPr>
-          <w:rFonts w:ascii="Arial" w:cs="Arial" w:eastAsia="Arial" w:hAnsi="Arial"/>
-          <w:b/>
-          <w:bCs/>
-          <w:color w:val="161F2D"/>
-          <w:sz w:val="20"/>
-          <w:szCs w:val="20"/>
-        </w:rPr>
-        <w:t xml:space="preserve">M3 + M4 — Tabela da Visão geral em 1440px.</w:t>
-      </w:r>
       <w:r>
         <w:rPr>
           <w:rFonts w:ascii="Arial" w:cs="Arial" w:eastAsia="Arial" w:hAnsi="Arial"/>
@@ -25513,29 +25816,1191 @@
           <w:sz w:val="20"/>
           <w:szCs w:val="20"/>
         </w:rPr>
-        <w:t xml:space="preserve"> Recomendo tirar a seleção de linhas (não há ação em lote) e deixar o nome da máquina quebrar em duas linhas. Assim a tabela cabe inteira com a navegação aberta.</w:t>
+        <w:t xml:space="preserve">Decididas em 08/10/2026:</w:t>
       </w:r>
     </w:p>
+    <w:tbl>
+      <w:tblPr>
+        <w:tblW w:type="dxa" w:w="7400"/>
+        <w:tblBorders>
+          <w:top w:val="single" w:color="D9DEE5" w:sz="4"/>
+          <w:left w:val="none" w:color="FFFFFF" w:sz="0"/>
+          <w:bottom w:val="single" w:color="D9DEE5" w:sz="4"/>
+          <w:right w:val="none" w:color="FFFFFF" w:sz="0"/>
+          <w:insideH w:val="single" w:color="D9DEE5" w:sz="4"/>
+          <w:insideV w:val="none" w:color="FFFFFF" w:sz="0"/>
+        </w:tblBorders>
+        <w:tblLayout w:type="fixed"/>
+      </w:tblPr>
+      <w:tblGrid>
+        <w:gridCol w:w="3900"/>
+        <w:gridCol w:w="2000"/>
+        <w:gridCol w:w="1500"/>
+      </w:tblGrid>
+      <w:tr>
+        <w:trPr>
+          <w:cantSplit/>
+          <w:tblHeader/>
+        </w:trPr>
+        <w:tc>
+          <w:tcPr>
+            <w:tcW w:type="dxa" w:w="3900"/>
+            <w:tcBorders>
+              <w:bottom w:val="single" w:color="5D6979" w:sz="6"/>
+            </w:tcBorders>
+            <w:shd w:fill="F7F9FA" w:color="auto" w:val="clear"/>
+            <w:tcMar>
+              <w:top w:type="dxa" w:w="70"/>
+              <w:left w:type="dxa" w:w="120"/>
+              <w:bottom w:type="dxa" w:w="70"/>
+              <w:right w:type="dxa" w:w="120"/>
+            </w:tcMar>
+            <w:vAlign w:val="center"/>
+          </w:tcPr>
+          <w:p>
+            <w:pPr>
+              <w:keepNext/>
+              <w:spacing w:after="0" w:before="0" w:line="252" w:lineRule="auto"/>
+              <w:jc w:val="left"/>
+            </w:pPr>
+            <w:r>
+              <w:rPr>
+                <w:rFonts w:ascii="Arial" w:cs="Arial" w:eastAsia="Arial" w:hAnsi="Arial"/>
+                <w:b/>
+                <w:bCs/>
+                <w:color w:val="434F60"/>
+                <w:sz w:val="18"/>
+                <w:szCs w:val="18"/>
+              </w:rPr>
+              <w:t xml:space="preserve">Item</w:t>
+            </w:r>
+          </w:p>
+        </w:tc>
+        <w:tc>
+          <w:tcPr>
+            <w:tcW w:type="dxa" w:w="2000"/>
+            <w:tcBorders>
+              <w:bottom w:val="single" w:color="5D6979" w:sz="6"/>
+            </w:tcBorders>
+            <w:shd w:fill="F7F9FA" w:color="auto" w:val="clear"/>
+            <w:tcMar>
+              <w:top w:type="dxa" w:w="70"/>
+              <w:left w:type="dxa" w:w="120"/>
+              <w:bottom w:type="dxa" w:w="70"/>
+              <w:right w:type="dxa" w:w="120"/>
+            </w:tcMar>
+            <w:vAlign w:val="center"/>
+          </w:tcPr>
+          <w:p>
+            <w:pPr>
+              <w:keepNext/>
+              <w:spacing w:after="0" w:before="0" w:line="252" w:lineRule="auto"/>
+              <w:jc w:val="left"/>
+            </w:pPr>
+            <w:r>
+              <w:rPr>
+                <w:rFonts w:ascii="Arial" w:cs="Arial" w:eastAsia="Arial" w:hAnsi="Arial"/>
+                <w:b/>
+                <w:bCs/>
+                <w:color w:val="434F60"/>
+                <w:sz w:val="18"/>
+                <w:szCs w:val="18"/>
+              </w:rPr>
+              <w:t xml:space="preserve">Decisão</w:t>
+            </w:r>
+          </w:p>
+        </w:tc>
+        <w:tc>
+          <w:tcPr>
+            <w:tcW w:type="dxa" w:w="1500"/>
+            <w:tcBorders>
+              <w:bottom w:val="single" w:color="5D6979" w:sz="6"/>
+            </w:tcBorders>
+            <w:shd w:fill="F7F9FA" w:color="auto" w:val="clear"/>
+            <w:tcMar>
+              <w:top w:type="dxa" w:w="70"/>
+              <w:left w:type="dxa" w:w="120"/>
+              <w:bottom w:type="dxa" w:w="70"/>
+              <w:right w:type="dxa" w:w="120"/>
+            </w:tcMar>
+            <w:vAlign w:val="center"/>
+          </w:tcPr>
+          <w:p>
+            <w:pPr>
+              <w:keepNext/>
+              <w:spacing w:after="0" w:before="0" w:line="252" w:lineRule="auto"/>
+              <w:jc w:val="left"/>
+            </w:pPr>
+            <w:r>
+              <w:rPr>
+                <w:rFonts w:ascii="Arial" w:cs="Arial" w:eastAsia="Arial" w:hAnsi="Arial"/>
+                <w:b/>
+                <w:bCs/>
+                <w:color w:val="434F60"/>
+                <w:sz w:val="18"/>
+                <w:szCs w:val="18"/>
+              </w:rPr>
+              <w:t xml:space="preserve">Status</w:t>
+            </w:r>
+          </w:p>
+        </w:tc>
+      </w:tr>
+      <w:tr>
+        <w:trPr>
+          <w:cantSplit/>
+        </w:trPr>
+        <w:tc>
+          <w:tcPr>
+            <w:tcW w:type="dxa" w:w="3900"/>
+            <w:tcMar>
+              <w:top w:type="dxa" w:w="70"/>
+              <w:left w:type="dxa" w:w="120"/>
+              <w:bottom w:type="dxa" w:w="70"/>
+              <w:right w:type="dxa" w:w="120"/>
+            </w:tcMar>
+            <w:vAlign w:val="center"/>
+          </w:tcPr>
+          <w:p>
+            <w:pPr>
+              <w:keepNext/>
+              <w:spacing w:after="0" w:before="0" w:line="252" w:lineRule="auto"/>
+              <w:jc w:val="left"/>
+            </w:pPr>
+            <w:r>
+              <w:rPr>
+                <w:rFonts w:ascii="Arial" w:cs="Arial" w:eastAsia="Arial" w:hAnsi="Arial"/>
+                <w:color w:val="161F2D"/>
+                <w:sz w:val="18"/>
+                <w:szCs w:val="18"/>
+              </w:rPr>
+              <w:t xml:space="preserve">M3 + M4 — tabela da Visão geral em 1440px</w:t>
+            </w:r>
+          </w:p>
+        </w:tc>
+        <w:tc>
+          <w:tcPr>
+            <w:tcW w:type="dxa" w:w="2000"/>
+            <w:tcMar>
+              <w:top w:type="dxa" w:w="70"/>
+              <w:left w:type="dxa" w:w="120"/>
+              <w:bottom w:type="dxa" w:w="70"/>
+              <w:right w:type="dxa" w:w="120"/>
+            </w:tcMar>
+            <w:vAlign w:val="center"/>
+          </w:tcPr>
+          <w:p>
+            <w:pPr>
+              <w:keepNext/>
+              <w:spacing w:after="0" w:before="0" w:line="252" w:lineRule="auto"/>
+              <w:jc w:val="left"/>
+            </w:pPr>
+            <w:r>
+              <w:rPr>
+                <w:rFonts w:ascii="Arial" w:cs="Arial" w:eastAsia="Arial" w:hAnsi="Arial"/>
+                <w:color w:val="161F2D"/>
+                <w:sz w:val="18"/>
+                <w:szCs w:val="18"/>
+              </w:rPr>
+              <w:t xml:space="preserve">Tirar a seleção de linhas e deixar o nome quebrar em duas linhas</w:t>
+            </w:r>
+          </w:p>
+        </w:tc>
+        <w:tc>
+          <w:tcPr>
+            <w:tcW w:type="dxa" w:w="1500"/>
+            <w:tcMar>
+              <w:top w:type="dxa" w:w="70"/>
+              <w:left w:type="dxa" w:w="120"/>
+              <w:bottom w:type="dxa" w:w="70"/>
+              <w:right w:type="dxa" w:w="120"/>
+            </w:tcMar>
+            <w:vAlign w:val="center"/>
+          </w:tcPr>
+          <w:p>
+            <w:pPr>
+              <w:keepNext/>
+              <w:spacing w:after="0" w:before="0" w:line="252" w:lineRule="auto"/>
+              <w:jc w:val="left"/>
+            </w:pPr>
+            <w:r>
+              <w:rPr>
+                <w:rFonts w:ascii="Arial" w:cs="Arial" w:eastAsia="Arial" w:hAnsi="Arial"/>
+                <w:color w:val="161F2D"/>
+                <w:sz w:val="18"/>
+                <w:szCs w:val="18"/>
+              </w:rPr>
+              <w:t xml:space="preserve">Feito (</w:t>
+            </w:r>
+            <w:r>
+              <w:rPr>
+                <w:rFonts w:ascii="Consolas" w:cs="Consolas" w:eastAsia="Consolas" w:hAnsi="Consolas"/>
+                <w:color w:val="161F2D"/>
+                <w:sz w:val="16"/>
+                <w:szCs w:val="16"/>
+              </w:rPr>
+              <w:t xml:space="preserve">42b5598</w:t>
+            </w:r>
+            <w:r>
+              <w:rPr>
+                <w:rFonts w:ascii="Arial" w:cs="Arial" w:eastAsia="Arial" w:hAnsi="Arial"/>
+                <w:color w:val="161F2D"/>
+                <w:sz w:val="18"/>
+                <w:szCs w:val="18"/>
+              </w:rPr>
+              <w:t xml:space="preserve">): a tabela cabe com a navegação aberta</w:t>
+            </w:r>
+          </w:p>
+        </w:tc>
+      </w:tr>
+      <w:tr>
+        <w:trPr>
+          <w:cantSplit/>
+        </w:trPr>
+        <w:tc>
+          <w:tcPr>
+            <w:tcW w:type="dxa" w:w="3900"/>
+            <w:tcMar>
+              <w:top w:type="dxa" w:w="70"/>
+              <w:left w:type="dxa" w:w="120"/>
+              <w:bottom w:type="dxa" w:w="70"/>
+              <w:right w:type="dxa" w:w="120"/>
+            </w:tcMar>
+            <w:vAlign w:val="center"/>
+          </w:tcPr>
+          <w:p>
+            <w:pPr>
+              <w:keepNext/>
+              <w:spacing w:after="0" w:before="0" w:line="252" w:lineRule="auto"/>
+              <w:jc w:val="left"/>
+            </w:pPr>
+            <w:r>
+              <w:rPr>
+                <w:rFonts w:ascii="Arial" w:cs="Arial" w:eastAsia="Arial" w:hAnsi="Arial"/>
+                <w:color w:val="161F2D"/>
+                <w:sz w:val="18"/>
+                <w:szCs w:val="18"/>
+              </w:rPr>
+              <w:t xml:space="preserve">M5 — etiqueta "Em produção"</w:t>
+            </w:r>
+          </w:p>
+        </w:tc>
+        <w:tc>
+          <w:tcPr>
+            <w:tcW w:type="dxa" w:w="2000"/>
+            <w:tcMar>
+              <w:top w:type="dxa" w:w="70"/>
+              <w:left w:type="dxa" w:w="120"/>
+              <w:bottom w:type="dxa" w:w="70"/>
+              <w:right w:type="dxa" w:w="120"/>
+            </w:tcMar>
+            <w:vAlign w:val="center"/>
+          </w:tcPr>
+          <w:p>
+            <w:pPr>
+              <w:keepNext/>
+              <w:spacing w:after="0" w:before="0" w:line="252" w:lineRule="auto"/>
+              <w:jc w:val="left"/>
+            </w:pPr>
+            <w:r>
+              <w:rPr>
+                <w:rFonts w:ascii="Arial" w:cs="Arial" w:eastAsia="Arial" w:hAnsi="Arial"/>
+                <w:color w:val="161F2D"/>
+                <w:sz w:val="18"/>
+                <w:szCs w:val="18"/>
+              </w:rPr>
+              <w:t xml:space="preserve">Tirar</w:t>
+            </w:r>
+          </w:p>
+        </w:tc>
+        <w:tc>
+          <w:tcPr>
+            <w:tcW w:type="dxa" w:w="1500"/>
+            <w:tcMar>
+              <w:top w:type="dxa" w:w="70"/>
+              <w:left w:type="dxa" w:w="120"/>
+              <w:bottom w:type="dxa" w:w="70"/>
+              <w:right w:type="dxa" w:w="120"/>
+            </w:tcMar>
+            <w:vAlign w:val="center"/>
+          </w:tcPr>
+          <w:p>
+            <w:pPr>
+              <w:keepNext/>
+              <w:spacing w:after="0" w:before="0" w:line="252" w:lineRule="auto"/>
+              <w:jc w:val="left"/>
+            </w:pPr>
+            <w:r>
+              <w:rPr>
+                <w:rFonts w:ascii="Arial" w:cs="Arial" w:eastAsia="Arial" w:hAnsi="Arial"/>
+                <w:color w:val="161F2D"/>
+                <w:sz w:val="18"/>
+                <w:szCs w:val="18"/>
+              </w:rPr>
+              <w:t xml:space="preserve">Feito (</w:t>
+            </w:r>
+            <w:r>
+              <w:rPr>
+                <w:rFonts w:ascii="Consolas" w:cs="Consolas" w:eastAsia="Consolas" w:hAnsi="Consolas"/>
+                <w:color w:val="161F2D"/>
+                <w:sz w:val="16"/>
+                <w:szCs w:val="16"/>
+              </w:rPr>
+              <w:t xml:space="preserve">42b5598</w:t>
+            </w:r>
+            <w:r>
+              <w:rPr>
+                <w:rFonts w:ascii="Arial" w:cs="Arial" w:eastAsia="Arial" w:hAnsi="Arial"/>
+                <w:color w:val="161F2D"/>
+                <w:sz w:val="18"/>
+                <w:szCs w:val="18"/>
+              </w:rPr>
+              <w:t xml:space="preserve">)</w:t>
+            </w:r>
+          </w:p>
+        </w:tc>
+      </w:tr>
+      <w:tr>
+        <w:trPr>
+          <w:cantSplit/>
+        </w:trPr>
+        <w:tc>
+          <w:tcPr>
+            <w:tcW w:type="dxa" w:w="3900"/>
+            <w:tcMar>
+              <w:top w:type="dxa" w:w="70"/>
+              <w:left w:type="dxa" w:w="120"/>
+              <w:bottom w:type="dxa" w:w="70"/>
+              <w:right w:type="dxa" w:w="120"/>
+            </w:tcMar>
+            <w:vAlign w:val="center"/>
+          </w:tcPr>
+          <w:p>
+            <w:pPr>
+              <w:keepNext/>
+              <w:spacing w:after="0" w:before="0" w:line="252" w:lineRule="auto"/>
+              <w:jc w:val="left"/>
+            </w:pPr>
+            <w:r>
+              <w:rPr>
+                <w:rFonts w:ascii="Arial" w:cs="Arial" w:eastAsia="Arial" w:hAnsi="Arial"/>
+                <w:color w:val="161F2D"/>
+                <w:sz w:val="18"/>
+                <w:szCs w:val="18"/>
+              </w:rPr>
+              <w:t xml:space="preserve">T12 — "Perfil" e "Preferências"</w:t>
+            </w:r>
+          </w:p>
+        </w:tc>
+        <w:tc>
+          <w:tcPr>
+            <w:tcW w:type="dxa" w:w="2000"/>
+            <w:tcMar>
+              <w:top w:type="dxa" w:w="70"/>
+              <w:left w:type="dxa" w:w="120"/>
+              <w:bottom w:type="dxa" w:w="70"/>
+              <w:right w:type="dxa" w:w="120"/>
+            </w:tcMar>
+            <w:vAlign w:val="center"/>
+          </w:tcPr>
+          <w:p>
+            <w:pPr>
+              <w:keepNext/>
+              <w:spacing w:after="0" w:before="0" w:line="252" w:lineRule="auto"/>
+              <w:jc w:val="left"/>
+            </w:pPr>
+            <w:r>
+              <w:rPr>
+                <w:rFonts w:ascii="Arial" w:cs="Arial" w:eastAsia="Arial" w:hAnsi="Arial"/>
+                <w:color w:val="161F2D"/>
+                <w:sz w:val="18"/>
+                <w:szCs w:val="18"/>
+              </w:rPr>
+              <w:t xml:space="preserve">Manter: as telas virão</w:t>
+            </w:r>
+          </w:p>
+        </w:tc>
+        <w:tc>
+          <w:tcPr>
+            <w:tcW w:type="dxa" w:w="1500"/>
+            <w:tcMar>
+              <w:top w:type="dxa" w:w="70"/>
+              <w:left w:type="dxa" w:w="120"/>
+              <w:bottom w:type="dxa" w:w="70"/>
+              <w:right w:type="dxa" w:w="120"/>
+            </w:tcMar>
+            <w:vAlign w:val="center"/>
+          </w:tcPr>
+          <w:p>
+            <w:pPr>
+              <w:keepNext/>
+              <w:spacing w:after="0" w:before="0" w:line="252" w:lineRule="auto"/>
+              <w:jc w:val="left"/>
+            </w:pPr>
+            <w:r>
+              <w:rPr>
+                <w:rFonts w:ascii="Arial" w:cs="Arial" w:eastAsia="Arial" w:hAnsi="Arial"/>
+                <w:color w:val="161F2D"/>
+                <w:sz w:val="18"/>
+                <w:szCs w:val="18"/>
+              </w:rPr>
+              <w:t xml:space="preserve">Adiado</w:t>
+            </w:r>
+          </w:p>
+        </w:tc>
+      </w:tr>
+      <w:tr>
+        <w:trPr>
+          <w:cantSplit/>
+        </w:trPr>
+        <w:tc>
+          <w:tcPr>
+            <w:tcW w:type="dxa" w:w="3900"/>
+            <w:tcMar>
+              <w:top w:type="dxa" w:w="70"/>
+              <w:left w:type="dxa" w:w="120"/>
+              <w:bottom w:type="dxa" w:w="70"/>
+              <w:right w:type="dxa" w:w="120"/>
+            </w:tcMar>
+            <w:vAlign w:val="center"/>
+          </w:tcPr>
+          <w:p>
+            <w:pPr>
+              <w:keepNext/>
+              <w:spacing w:after="0" w:before="0" w:line="252" w:lineRule="auto"/>
+              <w:jc w:val="left"/>
+            </w:pPr>
+            <w:r>
+              <w:rPr>
+                <w:rFonts w:ascii="Arial" w:cs="Arial" w:eastAsia="Arial" w:hAnsi="Arial"/>
+                <w:color w:val="161F2D"/>
+                <w:sz w:val="18"/>
+                <w:szCs w:val="18"/>
+              </w:rPr>
+              <w:t xml:space="preserve">Aj5 — "Falar com o suporte"</w:t>
+            </w:r>
+          </w:p>
+        </w:tc>
+        <w:tc>
+          <w:tcPr>
+            <w:tcW w:type="dxa" w:w="2000"/>
+            <w:tcMar>
+              <w:top w:type="dxa" w:w="70"/>
+              <w:left w:type="dxa" w:w="120"/>
+              <w:bottom w:type="dxa" w:w="70"/>
+              <w:right w:type="dxa" w:w="120"/>
+            </w:tcMar>
+            <w:vAlign w:val="center"/>
+          </w:tcPr>
+          <w:p>
+            <w:pPr>
+              <w:keepNext/>
+              <w:spacing w:after="0" w:before="0" w:line="252" w:lineRule="auto"/>
+              <w:jc w:val="left"/>
+            </w:pPr>
+            <w:r>
+              <w:rPr>
+                <w:rFonts w:ascii="Arial" w:cs="Arial" w:eastAsia="Arial" w:hAnsi="Arial"/>
+                <w:color w:val="161F2D"/>
+                <w:sz w:val="18"/>
+                <w:szCs w:val="18"/>
+              </w:rPr>
+              <w:t xml:space="preserve">Tirar o botão</w:t>
+            </w:r>
+          </w:p>
+        </w:tc>
+        <w:tc>
+          <w:tcPr>
+            <w:tcW w:type="dxa" w:w="1500"/>
+            <w:tcMar>
+              <w:top w:type="dxa" w:w="70"/>
+              <w:left w:type="dxa" w:w="120"/>
+              <w:bottom w:type="dxa" w:w="70"/>
+              <w:right w:type="dxa" w:w="120"/>
+            </w:tcMar>
+            <w:vAlign w:val="center"/>
+          </w:tcPr>
+          <w:p>
+            <w:pPr>
+              <w:keepNext/>
+              <w:spacing w:after="0" w:before="0" w:line="252" w:lineRule="auto"/>
+              <w:jc w:val="left"/>
+            </w:pPr>
+            <w:r>
+              <w:rPr>
+                <w:rFonts w:ascii="Arial" w:cs="Arial" w:eastAsia="Arial" w:hAnsi="Arial"/>
+                <w:color w:val="161F2D"/>
+                <w:sz w:val="18"/>
+                <w:szCs w:val="18"/>
+              </w:rPr>
+              <w:t xml:space="preserve">Feito (</w:t>
+            </w:r>
+            <w:r>
+              <w:rPr>
+                <w:rFonts w:ascii="Consolas" w:cs="Consolas" w:eastAsia="Consolas" w:hAnsi="Consolas"/>
+                <w:color w:val="161F2D"/>
+                <w:sz w:val="16"/>
+                <w:szCs w:val="16"/>
+              </w:rPr>
+              <w:t xml:space="preserve">42b5598</w:t>
+            </w:r>
+            <w:r>
+              <w:rPr>
+                <w:rFonts w:ascii="Arial" w:cs="Arial" w:eastAsia="Arial" w:hAnsi="Arial"/>
+                <w:color w:val="161F2D"/>
+                <w:sz w:val="18"/>
+                <w:szCs w:val="18"/>
+              </w:rPr>
+              <w:t xml:space="preserve">)</w:t>
+            </w:r>
+          </w:p>
+        </w:tc>
+      </w:tr>
+      <w:tr>
+        <w:trPr>
+          <w:cantSplit/>
+        </w:trPr>
+        <w:tc>
+          <w:tcPr>
+            <w:tcW w:type="dxa" w:w="3900"/>
+            <w:tcMar>
+              <w:top w:type="dxa" w:w="70"/>
+              <w:left w:type="dxa" w:w="120"/>
+              <w:bottom w:type="dxa" w:w="70"/>
+              <w:right w:type="dxa" w:w="120"/>
+            </w:tcMar>
+            <w:vAlign w:val="center"/>
+          </w:tcPr>
+          <w:p>
+            <w:pPr>
+              <w:keepNext/>
+              <w:spacing w:after="0" w:before="0" w:line="252" w:lineRule="auto"/>
+              <w:jc w:val="left"/>
+            </w:pPr>
+            <w:r>
+              <w:rPr>
+                <w:rFonts w:ascii="Arial" w:cs="Arial" w:eastAsia="Arial" w:hAnsi="Arial"/>
+                <w:color w:val="161F2D"/>
+                <w:sz w:val="18"/>
+                <w:szCs w:val="18"/>
+              </w:rPr>
+              <w:t xml:space="preserve">M7 — "Ver status do sistema"</w:t>
+            </w:r>
+          </w:p>
+        </w:tc>
+        <w:tc>
+          <w:tcPr>
+            <w:tcW w:type="dxa" w:w="2000"/>
+            <w:tcMar>
+              <w:top w:type="dxa" w:w="70"/>
+              <w:left w:type="dxa" w:w="120"/>
+              <w:bottom w:type="dxa" w:w="70"/>
+              <w:right w:type="dxa" w:w="120"/>
+            </w:tcMar>
+            <w:vAlign w:val="center"/>
+          </w:tcPr>
+          <w:p>
+            <w:pPr>
+              <w:keepNext/>
+              <w:spacing w:after="0" w:before="0" w:line="252" w:lineRule="auto"/>
+              <w:jc w:val="left"/>
+            </w:pPr>
+            <w:r>
+              <w:rPr>
+                <w:rFonts w:ascii="Arial" w:cs="Arial" w:eastAsia="Arial" w:hAnsi="Arial"/>
+                <w:color w:val="161F2D"/>
+                <w:sz w:val="18"/>
+                <w:szCs w:val="18"/>
+              </w:rPr>
+              <w:t xml:space="preserve">Tirar</w:t>
+            </w:r>
+          </w:p>
+        </w:tc>
+        <w:tc>
+          <w:tcPr>
+            <w:tcW w:type="dxa" w:w="1500"/>
+            <w:tcMar>
+              <w:top w:type="dxa" w:w="70"/>
+              <w:left w:type="dxa" w:w="120"/>
+              <w:bottom w:type="dxa" w:w="70"/>
+              <w:right w:type="dxa" w:w="120"/>
+            </w:tcMar>
+            <w:vAlign w:val="center"/>
+          </w:tcPr>
+          <w:p>
+            <w:pPr>
+              <w:keepNext/>
+              <w:spacing w:after="0" w:before="0" w:line="252" w:lineRule="auto"/>
+              <w:jc w:val="left"/>
+            </w:pPr>
+            <w:r>
+              <w:rPr>
+                <w:rFonts w:ascii="Arial" w:cs="Arial" w:eastAsia="Arial" w:hAnsi="Arial"/>
+                <w:color w:val="161F2D"/>
+                <w:sz w:val="18"/>
+                <w:szCs w:val="18"/>
+              </w:rPr>
+              <w:t xml:space="preserve">Feito (</w:t>
+            </w:r>
+            <w:r>
+              <w:rPr>
+                <w:rFonts w:ascii="Consolas" w:cs="Consolas" w:eastAsia="Consolas" w:hAnsi="Consolas"/>
+                <w:color w:val="161F2D"/>
+                <w:sz w:val="16"/>
+                <w:szCs w:val="16"/>
+              </w:rPr>
+              <w:t xml:space="preserve">42b5598</w:t>
+            </w:r>
+            <w:r>
+              <w:rPr>
+                <w:rFonts w:ascii="Arial" w:cs="Arial" w:eastAsia="Arial" w:hAnsi="Arial"/>
+                <w:color w:val="161F2D"/>
+                <w:sz w:val="18"/>
+                <w:szCs w:val="18"/>
+              </w:rPr>
+              <w:t xml:space="preserve">)</w:t>
+            </w:r>
+          </w:p>
+        </w:tc>
+      </w:tr>
+      <w:tr>
+        <w:trPr>
+          <w:cantSplit/>
+        </w:trPr>
+        <w:tc>
+          <w:tcPr>
+            <w:tcW w:type="dxa" w:w="3900"/>
+            <w:tcMar>
+              <w:top w:type="dxa" w:w="70"/>
+              <w:left w:type="dxa" w:w="120"/>
+              <w:bottom w:type="dxa" w:w="70"/>
+              <w:right w:type="dxa" w:w="120"/>
+            </w:tcMar>
+            <w:vAlign w:val="center"/>
+          </w:tcPr>
+          <w:p>
+            <w:pPr>
+              <w:keepNext/>
+              <w:spacing w:after="0" w:before="0" w:line="252" w:lineRule="auto"/>
+              <w:jc w:val="left"/>
+            </w:pPr>
+            <w:r>
+              <w:rPr>
+                <w:rFonts w:ascii="Arial" w:cs="Arial" w:eastAsia="Arial" w:hAnsi="Arial"/>
+                <w:color w:val="161F2D"/>
+                <w:sz w:val="18"/>
+                <w:szCs w:val="18"/>
+              </w:rPr>
+              <w:t xml:space="preserve">A1 — ajuda repetida no Apontamento</w:t>
+            </w:r>
+          </w:p>
+        </w:tc>
+        <w:tc>
+          <w:tcPr>
+            <w:tcW w:type="dxa" w:w="2000"/>
+            <w:tcMar>
+              <w:top w:type="dxa" w:w="70"/>
+              <w:left w:type="dxa" w:w="120"/>
+              <w:bottom w:type="dxa" w:w="70"/>
+              <w:right w:type="dxa" w:w="120"/>
+            </w:tcMar>
+            <w:vAlign w:val="center"/>
+          </w:tcPr>
+          <w:p>
+            <w:pPr>
+              <w:keepNext/>
+              <w:spacing w:after="0" w:before="0" w:line="252" w:lineRule="auto"/>
+              <w:jc w:val="left"/>
+            </w:pPr>
+            <w:r>
+              <w:rPr>
+                <w:rFonts w:ascii="Arial" w:cs="Arial" w:eastAsia="Arial" w:hAnsi="Arial"/>
+                <w:color w:val="161F2D"/>
+                <w:sz w:val="18"/>
+                <w:szCs w:val="18"/>
+              </w:rPr>
+              <w:t xml:space="preserve">Só onde o nº de pessoas muda a meta</w:t>
+            </w:r>
+          </w:p>
+        </w:tc>
+        <w:tc>
+          <w:tcPr>
+            <w:tcW w:type="dxa" w:w="1500"/>
+            <w:tcMar>
+              <w:top w:type="dxa" w:w="70"/>
+              <w:left w:type="dxa" w:w="120"/>
+              <w:bottom w:type="dxa" w:w="70"/>
+              <w:right w:type="dxa" w:w="120"/>
+            </w:tcMar>
+            <w:vAlign w:val="center"/>
+          </w:tcPr>
+          <w:p>
+            <w:pPr>
+              <w:keepNext/>
+              <w:spacing w:after="0" w:before="0" w:line="252" w:lineRule="auto"/>
+              <w:jc w:val="left"/>
+            </w:pPr>
+            <w:r>
+              <w:rPr>
+                <w:rFonts w:ascii="Arial" w:cs="Arial" w:eastAsia="Arial" w:hAnsi="Arial"/>
+                <w:color w:val="161F2D"/>
+                <w:sz w:val="18"/>
+                <w:szCs w:val="18"/>
+              </w:rPr>
+              <w:t xml:space="preserve">Feito (</w:t>
+            </w:r>
+            <w:r>
+              <w:rPr>
+                <w:rFonts w:ascii="Consolas" w:cs="Consolas" w:eastAsia="Consolas" w:hAnsi="Consolas"/>
+                <w:color w:val="161F2D"/>
+                <w:sz w:val="16"/>
+                <w:szCs w:val="16"/>
+              </w:rPr>
+              <w:t xml:space="preserve">09f765e</w:t>
+            </w:r>
+            <w:r>
+              <w:rPr>
+                <w:rFonts w:ascii="Arial" w:cs="Arial" w:eastAsia="Arial" w:hAnsi="Arial"/>
+                <w:color w:val="161F2D"/>
+                <w:sz w:val="18"/>
+                <w:szCs w:val="18"/>
+              </w:rPr>
+              <w:t xml:space="preserve">)</w:t>
+            </w:r>
+          </w:p>
+        </w:tc>
+      </w:tr>
+      <w:tr>
+        <w:trPr>
+          <w:cantSplit/>
+        </w:trPr>
+        <w:tc>
+          <w:tcPr>
+            <w:tcW w:type="dxa" w:w="3900"/>
+            <w:tcMar>
+              <w:top w:type="dxa" w:w="70"/>
+              <w:left w:type="dxa" w:w="120"/>
+              <w:bottom w:type="dxa" w:w="70"/>
+              <w:right w:type="dxa" w:w="120"/>
+            </w:tcMar>
+            <w:vAlign w:val="center"/>
+          </w:tcPr>
+          <w:p>
+            <w:pPr>
+              <w:keepNext/>
+              <w:spacing w:after="0" w:before="0" w:line="252" w:lineRule="auto"/>
+              <w:jc w:val="left"/>
+            </w:pPr>
+            <w:r>
+              <w:rPr>
+                <w:rFonts w:ascii="Arial" w:cs="Arial" w:eastAsia="Arial" w:hAnsi="Arial"/>
+                <w:color w:val="161F2D"/>
+                <w:sz w:val="18"/>
+                <w:szCs w:val="18"/>
+              </w:rPr>
+              <w:t xml:space="preserve">A3 — confirmar "Descartar alterações"</w:t>
+            </w:r>
+          </w:p>
+        </w:tc>
+        <w:tc>
+          <w:tcPr>
+            <w:tcW w:type="dxa" w:w="2000"/>
+            <w:tcMar>
+              <w:top w:type="dxa" w:w="70"/>
+              <w:left w:type="dxa" w:w="120"/>
+              <w:bottom w:type="dxa" w:w="70"/>
+              <w:right w:type="dxa" w:w="120"/>
+            </w:tcMar>
+            <w:vAlign w:val="center"/>
+          </w:tcPr>
+          <w:p>
+            <w:pPr>
+              <w:keepNext/>
+              <w:spacing w:after="0" w:before="0" w:line="252" w:lineRule="auto"/>
+              <w:jc w:val="left"/>
+            </w:pPr>
+            <w:r>
+              <w:rPr>
+                <w:rFonts w:ascii="Arial" w:cs="Arial" w:eastAsia="Arial" w:hAnsi="Arial"/>
+                <w:color w:val="161F2D"/>
+                <w:sz w:val="18"/>
+                <w:szCs w:val="18"/>
+              </w:rPr>
+              <w:t xml:space="preserve">Confirmar</w:t>
+            </w:r>
+          </w:p>
+        </w:tc>
+        <w:tc>
+          <w:tcPr>
+            <w:tcW w:type="dxa" w:w="1500"/>
+            <w:tcMar>
+              <w:top w:type="dxa" w:w="70"/>
+              <w:left w:type="dxa" w:w="120"/>
+              <w:bottom w:type="dxa" w:w="70"/>
+              <w:right w:type="dxa" w:w="120"/>
+            </w:tcMar>
+            <w:vAlign w:val="center"/>
+          </w:tcPr>
+          <w:p>
+            <w:pPr>
+              <w:keepNext/>
+              <w:spacing w:after="0" w:before="0" w:line="252" w:lineRule="auto"/>
+              <w:jc w:val="left"/>
+            </w:pPr>
+            <w:r>
+              <w:rPr>
+                <w:rFonts w:ascii="Arial" w:cs="Arial" w:eastAsia="Arial" w:hAnsi="Arial"/>
+                <w:color w:val="161F2D"/>
+                <w:sz w:val="18"/>
+                <w:szCs w:val="18"/>
+              </w:rPr>
+              <w:t xml:space="preserve">Feito (</w:t>
+            </w:r>
+            <w:r>
+              <w:rPr>
+                <w:rFonts w:ascii="Consolas" w:cs="Consolas" w:eastAsia="Consolas" w:hAnsi="Consolas"/>
+                <w:color w:val="161F2D"/>
+                <w:sz w:val="16"/>
+                <w:szCs w:val="16"/>
+              </w:rPr>
+              <w:t xml:space="preserve">09f765e</w:t>
+            </w:r>
+            <w:r>
+              <w:rPr>
+                <w:rFonts w:ascii="Arial" w:cs="Arial" w:eastAsia="Arial" w:hAnsi="Arial"/>
+                <w:color w:val="161F2D"/>
+                <w:sz w:val="18"/>
+                <w:szCs w:val="18"/>
+              </w:rPr>
+              <w:t xml:space="preserve">)</w:t>
+            </w:r>
+          </w:p>
+        </w:tc>
+      </w:tr>
+      <w:tr>
+        <w:trPr>
+          <w:cantSplit/>
+        </w:trPr>
+        <w:tc>
+          <w:tcPr>
+            <w:tcW w:type="dxa" w:w="3900"/>
+            <w:tcMar>
+              <w:top w:type="dxa" w:w="70"/>
+              <w:left w:type="dxa" w:w="120"/>
+              <w:bottom w:type="dxa" w:w="70"/>
+              <w:right w:type="dxa" w:w="120"/>
+            </w:tcMar>
+            <w:vAlign w:val="center"/>
+          </w:tcPr>
+          <w:p>
+            <w:pPr>
+              <w:keepNext/>
+              <w:spacing w:after="0" w:before="0" w:line="252" w:lineRule="auto"/>
+              <w:jc w:val="left"/>
+            </w:pPr>
+            <w:r>
+              <w:rPr>
+                <w:rFonts w:ascii="Arial" w:cs="Arial" w:eastAsia="Arial" w:hAnsi="Arial"/>
+                <w:color w:val="161F2D"/>
+                <w:sz w:val="18"/>
+                <w:szCs w:val="18"/>
+              </w:rPr>
+              <w:t xml:space="preserve">Rw2 — filtro de período no Retrabalho</w:t>
+            </w:r>
+          </w:p>
+        </w:tc>
+        <w:tc>
+          <w:tcPr>
+            <w:tcW w:type="dxa" w:w="2000"/>
+            <w:tcMar>
+              <w:top w:type="dxa" w:w="70"/>
+              <w:left w:type="dxa" w:w="120"/>
+              <w:bottom w:type="dxa" w:w="70"/>
+              <w:right w:type="dxa" w:w="120"/>
+            </w:tcMar>
+            <w:vAlign w:val="center"/>
+          </w:tcPr>
+          <w:p>
+            <w:pPr>
+              <w:keepNext/>
+              <w:spacing w:after="0" w:before="0" w:line="252" w:lineRule="auto"/>
+              <w:jc w:val="left"/>
+            </w:pPr>
+            <w:r>
+              <w:rPr>
+                <w:rFonts w:ascii="Arial" w:cs="Arial" w:eastAsia="Arial" w:hAnsi="Arial"/>
+                <w:color w:val="161F2D"/>
+                <w:sz w:val="18"/>
+                <w:szCs w:val="18"/>
+              </w:rPr>
+              <w:t xml:space="preserve">Colocar o seletor do Dashboard</w:t>
+            </w:r>
+          </w:p>
+        </w:tc>
+        <w:tc>
+          <w:tcPr>
+            <w:tcW w:type="dxa" w:w="1500"/>
+            <w:tcMar>
+              <w:top w:type="dxa" w:w="70"/>
+              <w:left w:type="dxa" w:w="120"/>
+              <w:bottom w:type="dxa" w:w="70"/>
+              <w:right w:type="dxa" w:w="120"/>
+            </w:tcMar>
+            <w:vAlign w:val="center"/>
+          </w:tcPr>
+          <w:p>
+            <w:pPr>
+              <w:keepNext/>
+              <w:spacing w:after="0" w:before="0" w:line="252" w:lineRule="auto"/>
+              <w:jc w:val="left"/>
+            </w:pPr>
+            <w:r>
+              <w:rPr>
+                <w:rFonts w:ascii="Arial" w:cs="Arial" w:eastAsia="Arial" w:hAnsi="Arial"/>
+                <w:color w:val="161F2D"/>
+                <w:sz w:val="18"/>
+                <w:szCs w:val="18"/>
+              </w:rPr>
+              <w:t xml:space="preserve">Feito (</w:t>
+            </w:r>
+            <w:r>
+              <w:rPr>
+                <w:rFonts w:ascii="Consolas" w:cs="Consolas" w:eastAsia="Consolas" w:hAnsi="Consolas"/>
+                <w:color w:val="161F2D"/>
+                <w:sz w:val="16"/>
+                <w:szCs w:val="16"/>
+              </w:rPr>
+              <w:t xml:space="preserve">52d661c</w:t>
+            </w:r>
+            <w:r>
+              <w:rPr>
+                <w:rFonts w:ascii="Arial" w:cs="Arial" w:eastAsia="Arial" w:hAnsi="Arial"/>
+                <w:color w:val="161F2D"/>
+                <w:sz w:val="18"/>
+                <w:szCs w:val="18"/>
+              </w:rPr>
+              <w:t xml:space="preserve">)</w:t>
+            </w:r>
+          </w:p>
+        </w:tc>
+      </w:tr>
+      <w:tr>
+        <w:trPr>
+          <w:cantSplit/>
+        </w:trPr>
+        <w:tc>
+          <w:tcPr>
+            <w:tcW w:type="dxa" w:w="3900"/>
+            <w:tcMar>
+              <w:top w:type="dxa" w:w="70"/>
+              <w:left w:type="dxa" w:w="120"/>
+              <w:bottom w:type="dxa" w:w="70"/>
+              <w:right w:type="dxa" w:w="120"/>
+            </w:tcMar>
+            <w:vAlign w:val="center"/>
+          </w:tcPr>
+          <w:p>
+            <w:pPr>
+              <w:keepNext/>
+              <w:spacing w:after="0" w:before="0" w:line="252" w:lineRule="auto"/>
+              <w:jc w:val="left"/>
+            </w:pPr>
+            <w:r>
+              <w:rPr>
+                <w:rFonts w:ascii="Arial" w:cs="Arial" w:eastAsia="Arial" w:hAnsi="Arial"/>
+                <w:color w:val="161F2D"/>
+                <w:sz w:val="18"/>
+                <w:szCs w:val="18"/>
+              </w:rPr>
+              <w:t xml:space="preserve">F2 e Me1 — descrições de Feedbacks e Metas</w:t>
+            </w:r>
+          </w:p>
+        </w:tc>
+        <w:tc>
+          <w:tcPr>
+            <w:tcW w:type="dxa" w:w="2000"/>
+            <w:tcMar>
+              <w:top w:type="dxa" w:w="70"/>
+              <w:left w:type="dxa" w:w="120"/>
+              <w:bottom w:type="dxa" w:w="70"/>
+              <w:right w:type="dxa" w:w="120"/>
+            </w:tcMar>
+            <w:vAlign w:val="center"/>
+          </w:tcPr>
+          <w:p>
+            <w:pPr>
+              <w:keepNext/>
+              <w:spacing w:after="0" w:before="0" w:line="252" w:lineRule="auto"/>
+              <w:jc w:val="left"/>
+            </w:pPr>
+            <w:r>
+              <w:rPr>
+                <w:rFonts w:ascii="Arial" w:cs="Arial" w:eastAsia="Arial" w:hAnsi="Arial"/>
+                <w:color w:val="161F2D"/>
+                <w:sz w:val="18"/>
+                <w:szCs w:val="18"/>
+              </w:rPr>
+              <w:t xml:space="preserve">Encurtar; tirar a fórmula de Metas</w:t>
+            </w:r>
+          </w:p>
+        </w:tc>
+        <w:tc>
+          <w:tcPr>
+            <w:tcW w:type="dxa" w:w="1500"/>
+            <w:tcMar>
+              <w:top w:type="dxa" w:w="70"/>
+              <w:left w:type="dxa" w:w="120"/>
+              <w:bottom w:type="dxa" w:w="70"/>
+              <w:right w:type="dxa" w:w="120"/>
+            </w:tcMar>
+            <w:vAlign w:val="center"/>
+          </w:tcPr>
+          <w:p>
+            <w:pPr>
+              <w:keepNext/>
+              <w:spacing w:after="0" w:before="0" w:line="252" w:lineRule="auto"/>
+              <w:jc w:val="left"/>
+            </w:pPr>
+            <w:r>
+              <w:rPr>
+                <w:rFonts w:ascii="Arial" w:cs="Arial" w:eastAsia="Arial" w:hAnsi="Arial"/>
+                <w:color w:val="161F2D"/>
+                <w:sz w:val="18"/>
+                <w:szCs w:val="18"/>
+              </w:rPr>
+              <w:t xml:space="preserve">Feito (</w:t>
+            </w:r>
+            <w:r>
+              <w:rPr>
+                <w:rFonts w:ascii="Consolas" w:cs="Consolas" w:eastAsia="Consolas" w:hAnsi="Consolas"/>
+                <w:color w:val="161F2D"/>
+                <w:sz w:val="16"/>
+                <w:szCs w:val="16"/>
+              </w:rPr>
+              <w:t xml:space="preserve">42b5598</w:t>
+            </w:r>
+            <w:r>
+              <w:rPr>
+                <w:rFonts w:ascii="Arial" w:cs="Arial" w:eastAsia="Arial" w:hAnsi="Arial"/>
+                <w:color w:val="161F2D"/>
+                <w:sz w:val="18"/>
+                <w:szCs w:val="18"/>
+              </w:rPr>
+              <w:t xml:space="preserve">)</w:t>
+            </w:r>
+          </w:p>
+        </w:tc>
+      </w:tr>
+      <w:tr>
+        <w:trPr>
+          <w:cantSplit/>
+        </w:trPr>
+        <w:tc>
+          <w:tcPr>
+            <w:tcW w:type="dxa" w:w="3900"/>
+            <w:tcMar>
+              <w:top w:type="dxa" w:w="70"/>
+              <w:left w:type="dxa" w:w="120"/>
+              <w:bottom w:type="dxa" w:w="70"/>
+              <w:right w:type="dxa" w:w="120"/>
+            </w:tcMar>
+            <w:vAlign w:val="center"/>
+          </w:tcPr>
+          <w:p>
+            <w:pPr>
+              <w:spacing w:after="0" w:before="0" w:line="252" w:lineRule="auto"/>
+              <w:jc w:val="left"/>
+            </w:pPr>
+            <w:r>
+              <w:rPr>
+                <w:rFonts w:ascii="Arial" w:cs="Arial" w:eastAsia="Arial" w:hAnsi="Arial"/>
+                <w:color w:val="161F2D"/>
+                <w:sz w:val="18"/>
+                <w:szCs w:val="18"/>
+              </w:rPr>
+              <w:t xml:space="preserve">Novo — motivo do retrabalho</w:t>
+            </w:r>
+          </w:p>
+        </w:tc>
+        <w:tc>
+          <w:tcPr>
+            <w:tcW w:type="dxa" w:w="2000"/>
+            <w:tcMar>
+              <w:top w:type="dxa" w:w="70"/>
+              <w:left w:type="dxa" w:w="120"/>
+              <w:bottom w:type="dxa" w:w="70"/>
+              <w:right w:type="dxa" w:w="120"/>
+            </w:tcMar>
+            <w:vAlign w:val="center"/>
+          </w:tcPr>
+          <w:p>
+            <w:pPr>
+              <w:spacing w:after="0" w:before="0" w:line="252" w:lineRule="auto"/>
+              <w:jc w:val="left"/>
+            </w:pPr>
+            <w:r>
+              <w:rPr>
+                <w:rFonts w:ascii="Arial" w:cs="Arial" w:eastAsia="Arial" w:hAnsi="Arial"/>
+                <w:color w:val="161F2D"/>
+                <w:sz w:val="18"/>
+                <w:szCs w:val="18"/>
+              </w:rPr>
+              <w:t xml:space="preserve">Perguntar o motivo ao marcar retrabalho e levar ao gráfico</w:t>
+            </w:r>
+          </w:p>
+        </w:tc>
+        <w:tc>
+          <w:tcPr>
+            <w:tcW w:type="dxa" w:w="1500"/>
+            <w:tcMar>
+              <w:top w:type="dxa" w:w="70"/>
+              <w:left w:type="dxa" w:w="120"/>
+              <w:bottom w:type="dxa" w:w="70"/>
+              <w:right w:type="dxa" w:w="120"/>
+            </w:tcMar>
+            <w:vAlign w:val="center"/>
+          </w:tcPr>
+          <w:p>
+            <w:pPr>
+              <w:spacing w:after="0" w:before="0" w:line="252" w:lineRule="auto"/>
+              <w:jc w:val="left"/>
+            </w:pPr>
+            <w:r>
+              <w:rPr>
+                <w:rFonts w:ascii="Arial" w:cs="Arial" w:eastAsia="Arial" w:hAnsi="Arial"/>
+                <w:color w:val="161F2D"/>
+                <w:sz w:val="18"/>
+                <w:szCs w:val="18"/>
+              </w:rPr>
+              <w:t xml:space="preserve">Feito (</w:t>
+            </w:r>
+            <w:r>
+              <w:rPr>
+                <w:rFonts w:ascii="Consolas" w:cs="Consolas" w:eastAsia="Consolas" w:hAnsi="Consolas"/>
+                <w:color w:val="161F2D"/>
+                <w:sz w:val="16"/>
+                <w:szCs w:val="16"/>
+              </w:rPr>
+              <w:t xml:space="preserve">09f765e</w:t>
+            </w:r>
+            <w:r>
+              <w:rPr>
+                <w:rFonts w:ascii="Arial" w:cs="Arial" w:eastAsia="Arial" w:hAnsi="Arial"/>
+                <w:color w:val="161F2D"/>
+                <w:sz w:val="18"/>
+                <w:szCs w:val="18"/>
+              </w:rPr>
+              <w:t xml:space="preserve">), com recado ao banco</w:t>
+            </w:r>
+          </w:p>
+        </w:tc>
+      </w:tr>
+    </w:tbl>
     <w:p>
       <w:pPr>
-        <w:pStyle w:val="ListParagraph"/>
-        <w:numPr>
-          <w:ilvl w:val="0"/>
-          <w:numId w:val="3"/>
-        </w:numPr>
-        <w:spacing w:after="80"/>
+        <w:spacing w:after="120" w:before="0" w:line="200" w:lineRule="auto"/>
       </w:pPr>
-      <w:r>
-        <w:rPr>
-          <w:rFonts w:ascii="Arial" w:cs="Arial" w:eastAsia="Arial" w:hAnsi="Arial"/>
-          <w:b/>
-          <w:bCs/>
-          <w:color w:val="161F2D"/>
-          <w:sz w:val="20"/>
-          <w:szCs w:val="20"/>
-        </w:rPr>
-        <w:t xml:space="preserve">M5 — Etiqueta "Em produção"</w:t>
-      </w:r>
+    </w:p>
+    <w:p>
       <w:r>
         <w:rPr>
           <w:rFonts w:ascii="Arial" w:cs="Arial" w:eastAsia="Arial" w:hAnsi="Arial"/>
@@ -25543,7 +27008,7 @@
           <w:sz w:val="20"/>
           <w:szCs w:val="20"/>
         </w:rPr>
-        <w:t xml:space="preserve"> ao lado do título: recomendo tirar.</w:t>
+        <w:t xml:space="preserve">Ainda abertas:</w:t>
       </w:r>
     </w:p>
     <w:p>
@@ -25573,28 +27038,16 @@
           <w:sz w:val="20"/>
           <w:szCs w:val="20"/>
         </w:rPr>
-        <w:t xml:space="preserve"> levar ao Histórico (sem filtro por máquina, por enquanto) ou tirar até existir o filtro. Recomendo tirar.</w:t>
+        <w:t xml:space="preserve"> ficam no menu </w:t>
       </w:r>
-    </w:p>
-    <w:p>
-      <w:pPr>
-        <w:pStyle w:val="ListParagraph"/>
-        <w:numPr>
-          <w:ilvl w:val="0"/>
-          <w:numId w:val="3"/>
-        </w:numPr>
-        <w:spacing w:after="80"/>
-      </w:pPr>
       <w:r>
         <w:rPr>
-          <w:rFonts w:ascii="Arial" w:cs="Arial" w:eastAsia="Arial" w:hAnsi="Arial"/>
-          <w:b/>
-          <w:bCs/>
+          <w:rFonts w:ascii="Cambria Math" w:cs="Cambria Math" w:eastAsia="Cambria Math" w:hAnsi="Cambria Math"/>
           <w:color w:val="161F2D"/>
           <w:sz w:val="20"/>
           <w:szCs w:val="20"/>
         </w:rPr>
-        <w:t xml:space="preserve">T12 — "Perfil" e "Preferências"</w:t>
+        <w:t xml:space="preserve">⋯</w:t>
       </w:r>
       <w:r>
         <w:rPr>
@@ -25603,157 +27056,7 @@
           <w:sz w:val="20"/>
           <w:szCs w:val="20"/>
         </w:rPr>
-        <w:t xml:space="preserve"> no menu do usuário: recomendo tirar.</w:t>
-      </w:r>
-    </w:p>
-    <w:p>
-      <w:pPr>
-        <w:pStyle w:val="ListParagraph"/>
-        <w:numPr>
-          <w:ilvl w:val="0"/>
-          <w:numId w:val="3"/>
-        </w:numPr>
-        <w:spacing w:after="80"/>
-      </w:pPr>
-      <w:r>
-        <w:rPr>
-          <w:rFonts w:ascii="Arial" w:cs="Arial" w:eastAsia="Arial" w:hAnsi="Arial"/>
-          <w:b/>
-          <w:bCs/>
-          <w:color w:val="161F2D"/>
-          <w:sz w:val="20"/>
-          <w:szCs w:val="20"/>
-        </w:rPr>
-        <w:t xml:space="preserve">Aj5 — "Falar com o suporte":</w:t>
-      </w:r>
-      <w:r>
-        <w:rPr>
-          <w:rFonts w:ascii="Arial" w:cs="Arial" w:eastAsia="Arial" w:hAnsi="Arial"/>
-          <w:color w:val="161F2D"/>
-          <w:sz w:val="20"/>
-          <w:szCs w:val="20"/>
-        </w:rPr>
-        <w:t xml:space="preserve"> qual é o canal real? Sem ele, recomendo tirar o botão e deixar o texto com o contato.</w:t>
-      </w:r>
-    </w:p>
-    <w:p>
-      <w:pPr>
-        <w:pStyle w:val="ListParagraph"/>
-        <w:numPr>
-          <w:ilvl w:val="0"/>
-          <w:numId w:val="3"/>
-        </w:numPr>
-        <w:spacing w:after="80"/>
-      </w:pPr>
-      <w:r>
-        <w:rPr>
-          <w:rFonts w:ascii="Arial" w:cs="Arial" w:eastAsia="Arial" w:hAnsi="Arial"/>
-          <w:b/>
-          <w:bCs/>
-          <w:color w:val="161F2D"/>
-          <w:sz w:val="20"/>
-          <w:szCs w:val="20"/>
-        </w:rPr>
-        <w:t xml:space="preserve">M7 — "Ver status do sistema"</w:t>
-      </w:r>
-      <w:r>
-        <w:rPr>
-          <w:rFonts w:ascii="Arial" w:cs="Arial" w:eastAsia="Arial" w:hAnsi="Arial"/>
-          <w:color w:val="161F2D"/>
-          <w:sz w:val="20"/>
-          <w:szCs w:val="20"/>
-        </w:rPr>
-        <w:t xml:space="preserve"> no erro de demonstração: recomendo tirar.</w:t>
-      </w:r>
-    </w:p>
-    <w:p>
-      <w:pPr>
-        <w:pStyle w:val="ListParagraph"/>
-        <w:numPr>
-          <w:ilvl w:val="0"/>
-          <w:numId w:val="3"/>
-        </w:numPr>
-        <w:spacing w:after="80"/>
-      </w:pPr>
-      <w:r>
-        <w:rPr>
-          <w:rFonts w:ascii="Arial" w:cs="Arial" w:eastAsia="Arial" w:hAnsi="Arial"/>
-          <w:b/>
-          <w:bCs/>
-          <w:color w:val="161F2D"/>
-          <w:sz w:val="20"/>
-          <w:szCs w:val="20"/>
-        </w:rPr>
-        <w:t xml:space="preserve">A1 — Ajuda repetida no Apontamento:</w:t>
-      </w:r>
-      <w:r>
-        <w:rPr>
-          <w:rFonts w:ascii="Arial" w:cs="Arial" w:eastAsia="Arial" w:hAnsi="Arial"/>
-          <w:color w:val="161F2D"/>
-          <w:sz w:val="20"/>
-          <w:szCs w:val="20"/>
-        </w:rPr>
-        <w:t xml:space="preserve"> recomendo mostrar só quando muda a meta.</w:t>
-      </w:r>
-    </w:p>
-    <w:p>
-      <w:pPr>
-        <w:pStyle w:val="ListParagraph"/>
-        <w:numPr>
-          <w:ilvl w:val="0"/>
-          <w:numId w:val="3"/>
-        </w:numPr>
-        <w:spacing w:after="80"/>
-      </w:pPr>
-      <w:r>
-        <w:rPr>
-          <w:rFonts w:ascii="Arial" w:cs="Arial" w:eastAsia="Arial" w:hAnsi="Arial"/>
-          <w:b/>
-          <w:bCs/>
-          <w:color w:val="161F2D"/>
-          <w:sz w:val="20"/>
-          <w:szCs w:val="20"/>
-        </w:rPr>
-        <w:t xml:space="preserve">A3 — Confirmar "Descartar alterações":</w:t>
-      </w:r>
-      <w:r>
-        <w:rPr>
-          <w:rFonts w:ascii="Arial" w:cs="Arial" w:eastAsia="Arial" w:hAnsi="Arial"/>
-          <w:color w:val="161F2D"/>
-          <w:sz w:val="20"/>
-          <w:szCs w:val="20"/>
-        </w:rPr>
-        <w:t xml:space="preserve"> recomendo confirmar.</w:t>
-      </w:r>
-    </w:p>
-    <w:p>
-      <w:pPr>
-        <w:pStyle w:val="ListParagraph"/>
-        <w:numPr>
-          <w:ilvl w:val="0"/>
-          <w:numId w:val="3"/>
-        </w:numPr>
-        <w:spacing w:after="80"/>
-      </w:pPr>
-      <w:r>
-        <w:rPr>
-          <w:rFonts w:ascii="Arial" w:cs="Arial" w:eastAsia="Arial" w:hAnsi="Arial"/>
-          <w:b/>
-          <w:bCs/>
-          <w:color w:val="161F2D"/>
-          <w:sz w:val="20"/>
-          <w:szCs w:val="20"/>
-        </w:rPr>
-        <w:t xml:space="preserve">Rw2 — Filtro de período na tela Retrabalho</w:t>
-      </w:r>
-      <w:r>
-        <w:rPr>
-          <w:rFonts w:ascii="Arial" w:cs="Arial" w:eastAsia="Arial" w:hAnsi="Arial"/>
-          <w:color w:val="161F2D"/>
-          <w:sz w:val="20"/>
-          <w:szCs w:val="20"/>
-        </w:rPr>
-        <w:t xml:space="preserve"> (hoje só digo o período).</w:t>
+        <w:t xml:space="preserve"> de cada linha do Dashboard e no rodapé do painel que abre ao clicar numa máquina. Recomendo tirar até o Histórico filtrar por máquina.</w:t>
       </w:r>
     </w:p>
     <w:p>
@@ -25788,23 +27091,43 @@
     </w:p>
     <w:p>
       <w:pPr>
-        <w:pStyle w:val="ListParagraph"/>
-        <w:numPr>
-          <w:ilvl w:val="0"/>
-          <w:numId w:val="3"/>
-        </w:numPr>
-        <w:spacing w:after="80"/>
+        <w:spacing w:after="60" w:line="120" w:lineRule="auto"/>
       </w:pPr>
+    </w:p>
+    <w:p>
+      <w:pPr>
+        <w:pStyle w:val="Heading3"/>
+        <w:keepNext/>
+        <w:keepLines/>
+      </w:pPr>
+      <w:bookmarkStart w:name="r_55" w:id="19"/>
       <w:r>
         <w:rPr>
           <w:rFonts w:ascii="Arial" w:cs="Arial" w:eastAsia="Arial" w:hAnsi="Arial"/>
-          <w:b/>
-          <w:bCs/>
+        </w:rPr>
+        <w:t xml:space="preserve">Motivo do retrabalho</w:t>
+      </w:r>
+      <w:bookmarkEnd w:id="19"/>
+    </w:p>
+    <w:p>
+      <w:r>
+        <w:rPr>
+          <w:rFonts w:ascii="Arial" w:cs="Arial" w:eastAsia="Arial" w:hAnsi="Arial"/>
           <w:color w:val="161F2D"/>
           <w:sz w:val="20"/>
           <w:szCs w:val="20"/>
         </w:rPr>
-        <w:t xml:space="preserve">F2 e Me1 — Encurtar descrições</w:t>
+        <w:t xml:space="preserve">Ao marcar uma OP como retrabalho, o Apontamento mostra os motivos comuns (os mesmos do gráfico) e "Outro motivo", com campo livre. Sem motivo, a OP não salva. O contrato (</w:t>
+      </w:r>
+      <w:r>
+        <w:rPr>
+          <w:rFonts w:ascii="Consolas" w:cs="Consolas" w:eastAsia="Consolas" w:hAnsi="Consolas"/>
+          <w:color w:val="161F2D"/>
+          <w:sz w:val="18"/>
+          <w:szCs w:val="18"/>
+          <w:shd w:fill="EEF1F4" w:color="auto" w:val="clear"/>
+        </w:rPr>
+        <w:t xml:space="preserve">OrdemProducao</w:t>
       </w:r>
       <w:r>
         <w:rPr>
@@ -25813,13 +27136,46 @@
           <w:sz w:val="20"/>
           <w:szCs w:val="20"/>
         </w:rPr>
-        <w:t xml:space="preserve"> de Feedbacks e Metas.</w:t>
+        <w:t xml:space="preserve">) não tem campo de motivo, então, até o banco criar um, o motivo vai no campo </w:t>
       </w:r>
-    </w:p>
-    <w:p>
-      <w:pPr>
-        <w:spacing w:after="60" w:line="120" w:lineRule="auto"/>
-      </w:pPr>
+      <w:r>
+        <w:rPr>
+          <w:rFonts w:ascii="Consolas" w:cs="Consolas" w:eastAsia="Consolas" w:hAnsi="Consolas"/>
+          <w:color w:val="161F2D"/>
+          <w:sz w:val="18"/>
+          <w:szCs w:val="18"/>
+          <w:shd w:fill="EEF1F4" w:color="auto" w:val="clear"/>
+        </w:rPr>
+        <w:t xml:space="preserve">obs</w:t>
+      </w:r>
+      <w:r>
+        <w:rPr>
+          <w:rFonts w:ascii="Arial" w:cs="Arial" w:eastAsia="Arial" w:hAnsi="Arial"/>
+          <w:color w:val="161F2D"/>
+          <w:sz w:val="20"/>
+          <w:szCs w:val="20"/>
+        </w:rPr>
+        <w:t xml:space="preserve"> da própria OP de retrabalho e volta como motivo na leitura. OPs antigas sem motivo aparecem no gráfico como "Não informado". Recado ao banco: </w:t>
+      </w:r>
+      <w:r>
+        <w:rPr>
+          <w:rFonts w:ascii="Consolas" w:cs="Consolas" w:eastAsia="Consolas" w:hAnsi="Consolas"/>
+          <w:color w:val="161F2D"/>
+          <w:sz w:val="18"/>
+          <w:szCs w:val="18"/>
+          <w:shd w:fill="EEF1F4" w:color="auto" w:val="clear"/>
+        </w:rPr>
+        <w:t xml:space="preserve">docs/database/notas/2026-10-08-motivo-do-retrabalho.md</w:t>
+      </w:r>
+      <w:r>
+        <w:rPr>
+          <w:rFonts w:ascii="Arial" w:cs="Arial" w:eastAsia="Arial" w:hAnsi="Arial"/>
+          <w:color w:val="161F2D"/>
+          <w:sz w:val="20"/>
+          <w:szCs w:val="20"/>
+        </w:rPr>
+        <w:t xml:space="preserve">.</w:t>
+      </w:r>
     </w:p>
     <w:p>
       <w:pPr>
@@ -25827,14 +27183,14 @@
         <w:keepNext/>
         <w:keepLines/>
       </w:pPr>
-      <w:bookmarkStart w:name="r_51" w:id="19"/>
+      <w:bookmarkStart w:name="r_57" w:id="20"/>
       <w:r>
         <w:rPr>
           <w:rFonts w:ascii="Arial" w:cs="Arial" w:eastAsia="Arial" w:hAnsi="Arial"/>
         </w:rPr>
         <w:t xml:space="preserve">O que não mexi, de propósito</w:t>
       </w:r>
-      <w:bookmarkEnd w:id="19"/>
+      <w:bookmarkEnd w:id="20"/>
     </w:p>
     <w:p>
       <w:pPr>
@@ -25919,7 +27275,7 @@
           <w:sz w:val="20"/>
           <w:szCs w:val="20"/>
         </w:rPr>
-        <w:t xml:space="preserve">A camada de dados e o banco: nada aqui depende da outra sessão.</w:t>
+        <w:t xml:space="preserve">A camada de dados e o banco: nada mudou lá. Só o motivo do retrabalho espera um campo próprio da outra sessão (recado acima).</w:t>
       </w:r>
     </w:p>
     <w:p>
@@ -25963,14 +27319,14 @@
         <w:keepNext/>
         <w:keepLines/>
       </w:pPr>
-      <w:bookmarkStart w:name="anexo_galeria" w:id="20"/>
+      <w:bookmarkStart w:name="anexo_galeria" w:id="21"/>
       <w:r>
         <w:rPr>
           <w:rFonts w:ascii="Arial" w:cs="Arial" w:eastAsia="Arial" w:hAnsi="Arial"/>
         </w:rPr>
         <w:t xml:space="preserve">Antes e depois — auditoria de 07/10/2026</w:t>
       </w:r>
-      <w:bookmarkEnd w:id="20"/>
+      <w:bookmarkEnd w:id="21"/>
     </w:p>
     <w:p>
       <w:r>
@@ -26070,14 +27426,14 @@
         <w:keepLines/>
         <w:pageBreakBefore/>
       </w:pPr>
-      <w:bookmarkStart w:name="g_2" w:id="21"/>
+      <w:bookmarkStart w:name="g_2" w:id="22"/>
       <w:r>
         <w:rPr>
           <w:rFonts w:ascii="Arial" w:cs="Arial" w:eastAsia="Arial" w:hAnsi="Arial"/>
         </w:rPr>
         <w:t xml:space="preserve">Números que agora batem entre as telas</w:t>
       </w:r>
-      <w:bookmarkEnd w:id="21"/>
+      <w:bookmarkEnd w:id="22"/>
     </w:p>
     <w:p>
       <w:pPr>
@@ -26085,14 +27441,14 @@
         <w:keepNext/>
         <w:keepLines/>
       </w:pPr>
-      <w:bookmarkStart w:name="g_3" w:id="22"/>
+      <w:bookmarkStart w:name="g_3" w:id="23"/>
       <w:r>
         <w:rPr>
           <w:rFonts w:ascii="Arial" w:cs="Arial" w:eastAsia="Arial" w:hAnsi="Arial"/>
         </w:rPr>
         <w:t xml:space="preserve">Painel da máquina — total do dia sem retrabalho (M1, T6)</w:t>
       </w:r>
-      <w:bookmarkEnd w:id="22"/>
+      <w:bookmarkEnd w:id="23"/>
     </w:p>
     <w:p>
       <w:pPr>
@@ -26238,7 +27594,7 @@
                 <wp:inline distT="0" distB="0" distL="0" distR="0">
                   <wp:extent cx="1704975" cy="4038600"/>
                   <wp:effectExtent t="0" r="0" b="0" l="0"/>
-                  <wp:docPr id="1001" name="painel-retrabalho-1440-light.jpg" descr="Antes — Painel da máquina — total do dia sem retrabalho (M1, T6)" title="Antes — Painel da máquina — total do dia sem retrabalho (M1, T6)"/>
+                  <wp:docPr id="1" name="painel-retrabalho-1440-light.jpg" descr="Antes — Painel da máquina — total do dia sem retrabalho (M1, T6)" title="Antes — Painel da máquina — total do dia sem retrabalho (M1, T6)"/>
                   <wp:cNvGraphicFramePr>
                     <a:graphicFrameLocks xmlns:a="http://schemas.openxmlformats.org/drawingml/2006/main" noChangeAspect="1"/>
                   </wp:cNvGraphicFramePr>
@@ -26246,7 +27602,7 @@
                     <a:graphicData uri="http://schemas.openxmlformats.org/drawingml/2006/picture">
                       <pic:pic xmlns:pic="http://schemas.openxmlformats.org/drawingml/2006/picture">
                         <pic:nvPicPr>
-                          <pic:cNvPr id="1001" name="" descr=""/>
+                          <pic:cNvPr id="0" name="" descr=""/>
                           <pic:cNvPicPr>
                             <a:picLocks noChangeAspect="1" noChangeArrowheads="1"/>
                           </pic:cNvPicPr>
@@ -26296,7 +27652,7 @@
                 <wp:inline distT="0" distB="0" distL="0" distR="0">
                   <wp:extent cx="1704975" cy="4038600"/>
                   <wp:effectExtent t="0" r="0" b="0" l="0"/>
-                  <wp:docPr id="1002" name="painel-retrabalho-1440-light.jpg" descr="Depois — Painel da máquina — total do dia sem retrabalho (M1, T6)" title="Depois — Painel da máquina — total do dia sem retrabalho (M1, T6)"/>
+                  <wp:docPr id="2" name="painel-retrabalho-1440-light.jpg" descr="Depois — Painel da máquina — total do dia sem retrabalho (M1, T6)" title="Depois — Painel da máquina — total do dia sem retrabalho (M1, T6)"/>
                   <wp:cNvGraphicFramePr>
                     <a:graphicFrameLocks xmlns:a="http://schemas.openxmlformats.org/drawingml/2006/main" noChangeAspect="1"/>
                   </wp:cNvGraphicFramePr>
@@ -26304,7 +27660,7 @@
                     <a:graphicData uri="http://schemas.openxmlformats.org/drawingml/2006/picture">
                       <pic:pic xmlns:pic="http://schemas.openxmlformats.org/drawingml/2006/picture">
                         <pic:nvPicPr>
-                          <pic:cNvPr id="1002" name="" descr=""/>
+                          <pic:cNvPr id="0" name="" descr=""/>
                           <pic:cNvPicPr>
                             <a:picLocks noChangeAspect="1" noChangeArrowheads="1"/>
                           </pic:cNvPicPr>
@@ -26347,14 +27703,14 @@
         <w:keepLines/>
         <w:pageBreakBefore/>
       </w:pPr>
-      <w:bookmarkStart w:name="g_6" w:id="23"/>
+      <w:bookmarkStart w:name="g_6" w:id="24"/>
       <w:r>
         <w:rPr>
           <w:rFonts w:ascii="Arial" w:cs="Arial" w:eastAsia="Arial" w:hAnsi="Arial"/>
         </w:rPr>
         <w:t xml:space="preserve">Aba Gráficos — retrabalho fora da produção (M2, T1)</w:t>
       </w:r>
-      <w:bookmarkEnd w:id="23"/>
+      <w:bookmarkEnd w:id="24"/>
     </w:p>
     <w:p>
       <w:pPr>
@@ -26480,7 +27836,7 @@
                 <wp:inline distT="0" distB="0" distL="0" distR="0">
                   <wp:extent cx="4476750" cy="4038600"/>
                   <wp:effectExtent t="0" r="0" b="0" l="0"/>
-                  <wp:docPr id="1003" name="dashboard-graficos-1440-light.jpg" descr="Antes — Aba Gráficos — retrabalho fora da produção (M2, T1)" title="Antes — Aba Gráficos — retrabalho fora da produção (M2, T1)"/>
+                  <wp:docPr id="3" name="dashboard-graficos-1440-light.jpg" descr="Antes — Aba Gráficos — retrabalho fora da produção (M2, T1)" title="Antes — Aba Gráficos — retrabalho fora da produção (M2, T1)"/>
                   <wp:cNvGraphicFramePr>
                     <a:graphicFrameLocks xmlns:a="http://schemas.openxmlformats.org/drawingml/2006/main" noChangeAspect="1"/>
                   </wp:cNvGraphicFramePr>
@@ -26488,7 +27844,7 @@
                     <a:graphicData uri="http://schemas.openxmlformats.org/drawingml/2006/picture">
                       <pic:pic xmlns:pic="http://schemas.openxmlformats.org/drawingml/2006/picture">
                         <pic:nvPicPr>
-                          <pic:cNvPr id="1003" name="" descr=""/>
+                          <pic:cNvPr id="0" name="" descr=""/>
                           <pic:cNvPicPr>
                             <a:picLocks noChangeAspect="1" noChangeArrowheads="1"/>
                           </pic:cNvPicPr>
@@ -26538,7 +27894,7 @@
                 <wp:inline distT="0" distB="0" distL="0" distR="0">
                   <wp:extent cx="4476750" cy="4038600"/>
                   <wp:effectExtent t="0" r="0" b="0" l="0"/>
-                  <wp:docPr id="1004" name="dashboard-graficos-1440-light.jpg" descr="Depois — Aba Gráficos — retrabalho fora da produção (M2, T1)" title="Depois — Aba Gráficos — retrabalho fora da produção (M2, T1)"/>
+                  <wp:docPr id="4" name="dashboard-graficos-1440-light.jpg" descr="Depois — Aba Gráficos — retrabalho fora da produção (M2, T1)" title="Depois — Aba Gráficos — retrabalho fora da produção (M2, T1)"/>
                   <wp:cNvGraphicFramePr>
                     <a:graphicFrameLocks xmlns:a="http://schemas.openxmlformats.org/drawingml/2006/main" noChangeAspect="1"/>
                   </wp:cNvGraphicFramePr>
@@ -26546,7 +27902,7 @@
                     <a:graphicData uri="http://schemas.openxmlformats.org/drawingml/2006/picture">
                       <pic:pic xmlns:pic="http://schemas.openxmlformats.org/drawingml/2006/picture">
                         <pic:nvPicPr>
-                          <pic:cNvPr id="1004" name="" descr=""/>
+                          <pic:cNvPr id="0" name="" descr=""/>
                           <pic:cNvPicPr>
                             <a:picLocks noChangeAspect="1" noChangeArrowheads="1"/>
                           </pic:cNvPicPr>
@@ -26589,14 +27945,14 @@
         <w:keepLines/>
         <w:pageBreakBefore/>
       </w:pPr>
-      <w:bookmarkStart w:name="g_9" w:id="24"/>
+      <w:bookmarkStart w:name="g_9" w:id="25"/>
       <w:r>
         <w:rPr>
           <w:rFonts w:ascii="Arial" w:cs="Arial" w:eastAsia="Arial" w:hAnsi="Arial"/>
         </w:rPr>
         <w:t xml:space="preserve">Histórico — % da meta só com as máquinas que têm meta (H1, H2)</w:t>
       </w:r>
-      <w:bookmarkEnd w:id="24"/>
+      <w:bookmarkEnd w:id="25"/>
     </w:p>
     <w:p>
       <w:pPr>
@@ -26762,7 +28118,7 @@
                 <wp:inline distT="0" distB="0" distL="0" distR="0">
                   <wp:extent cx="4476750" cy="2800350"/>
                   <wp:effectExtent t="0" r="0" b="0" l="0"/>
-                  <wp:docPr id="1005" name="historico-1440-light.jpg" descr="Antes — Histórico — % da meta só com as máquinas que têm meta (H1, H2)" title="Antes — Histórico — % da meta só com as máquinas que têm meta (H1, H2)"/>
+                  <wp:docPr id="5" name="historico-1440-light.jpg" descr="Antes — Histórico — % da meta só com as máquinas que têm meta (H1, H2)" title="Antes — Histórico — % da meta só com as máquinas que têm meta (H1, H2)"/>
                   <wp:cNvGraphicFramePr>
                     <a:graphicFrameLocks xmlns:a="http://schemas.openxmlformats.org/drawingml/2006/main" noChangeAspect="1"/>
                   </wp:cNvGraphicFramePr>
@@ -26770,7 +28126,7 @@
                     <a:graphicData uri="http://schemas.openxmlformats.org/drawingml/2006/picture">
                       <pic:pic xmlns:pic="http://schemas.openxmlformats.org/drawingml/2006/picture">
                         <pic:nvPicPr>
-                          <pic:cNvPr id="1005" name="" descr=""/>
+                          <pic:cNvPr id="0" name="" descr=""/>
                           <pic:cNvPicPr>
                             <a:picLocks noChangeAspect="1" noChangeArrowheads="1"/>
                           </pic:cNvPicPr>
@@ -26820,7 +28176,7 @@
                 <wp:inline distT="0" distB="0" distL="0" distR="0">
                   <wp:extent cx="4476750" cy="2800350"/>
                   <wp:effectExtent t="0" r="0" b="0" l="0"/>
-                  <wp:docPr id="1006" name="historico-1440-light.jpg" descr="Depois — Histórico — % da meta só com as máquinas que têm meta (H1, H2)" title="Depois — Histórico — % da meta só com as máquinas que têm meta (H1, H2)"/>
+                  <wp:docPr id="6" name="historico-1440-light.jpg" descr="Depois — Histórico — % da meta só com as máquinas que têm meta (H1, H2)" title="Depois — Histórico — % da meta só com as máquinas que têm meta (H1, H2)"/>
                   <wp:cNvGraphicFramePr>
                     <a:graphicFrameLocks xmlns:a="http://schemas.openxmlformats.org/drawingml/2006/main" noChangeAspect="1"/>
                   </wp:cNvGraphicFramePr>
@@ -26828,7 +28184,7 @@
                     <a:graphicData uri="http://schemas.openxmlformats.org/drawingml/2006/picture">
                       <pic:pic xmlns:pic="http://schemas.openxmlformats.org/drawingml/2006/picture">
                         <pic:nvPicPr>
-                          <pic:cNvPr id="1006" name="" descr=""/>
+                          <pic:cNvPr id="0" name="" descr=""/>
                           <pic:cNvPicPr>
                             <a:picLocks noChangeAspect="1" noChangeArrowheads="1"/>
                           </pic:cNvPicPr>
@@ -26871,14 +28227,14 @@
         <w:keepLines/>
         <w:pageBreakBefore/>
       </w:pPr>
-      <w:bookmarkStart w:name="g_12" w:id="25"/>
+      <w:bookmarkStart w:name="g_12" w:id="26"/>
       <w:r>
         <w:rPr>
           <w:rFonts w:ascii="Arial" w:cs="Arial" w:eastAsia="Arial" w:hAnsi="Arial"/>
         </w:rPr>
         <w:t xml:space="preserve">Ranking — Turno 3 só com quem roda nele (Rk2)</w:t>
       </w:r>
-      <w:bookmarkEnd w:id="25"/>
+      <w:bookmarkEnd w:id="26"/>
     </w:p>
     <w:tbl>
       <w:tblPr>
@@ -26990,7 +28346,7 @@
                 <wp:inline distT="0" distB="0" distL="0" distR="0">
                   <wp:extent cx="4476750" cy="2800350"/>
                   <wp:effectExtent t="0" r="0" b="0" l="0"/>
-                  <wp:docPr id="1007" name="ranking-turno3-1440-light.jpg" descr="Antes — Ranking — Turno 3 só com quem roda nele (Rk2)" title="Antes — Ranking — Turno 3 só com quem roda nele (Rk2)"/>
+                  <wp:docPr id="7" name="ranking-turno3-1440-light.jpg" descr="Antes — Ranking — Turno 3 só com quem roda nele (Rk2)" title="Antes — Ranking — Turno 3 só com quem roda nele (Rk2)"/>
                   <wp:cNvGraphicFramePr>
                     <a:graphicFrameLocks xmlns:a="http://schemas.openxmlformats.org/drawingml/2006/main" noChangeAspect="1"/>
                   </wp:cNvGraphicFramePr>
@@ -26998,7 +28354,7 @@
                     <a:graphicData uri="http://schemas.openxmlformats.org/drawingml/2006/picture">
                       <pic:pic xmlns:pic="http://schemas.openxmlformats.org/drawingml/2006/picture">
                         <pic:nvPicPr>
-                          <pic:cNvPr id="1007" name="" descr=""/>
+                          <pic:cNvPr id="0" name="" descr=""/>
                           <pic:cNvPicPr>
                             <a:picLocks noChangeAspect="1" noChangeArrowheads="1"/>
                           </pic:cNvPicPr>
@@ -27048,7 +28404,7 @@
                 <wp:inline distT="0" distB="0" distL="0" distR="0">
                   <wp:extent cx="4476750" cy="2800350"/>
                   <wp:effectExtent t="0" r="0" b="0" l="0"/>
-                  <wp:docPr id="1008" name="ranking-turno3-1440-light.jpg" descr="Depois — Ranking — Turno 3 só com quem roda nele (Rk2)" title="Depois — Ranking — Turno 3 só com quem roda nele (Rk2)"/>
+                  <wp:docPr id="8" name="ranking-turno3-1440-light.jpg" descr="Depois — Ranking — Turno 3 só com quem roda nele (Rk2)" title="Depois — Ranking — Turno 3 só com quem roda nele (Rk2)"/>
                   <wp:cNvGraphicFramePr>
                     <a:graphicFrameLocks xmlns:a="http://schemas.openxmlformats.org/drawingml/2006/main" noChangeAspect="1"/>
                   </wp:cNvGraphicFramePr>
@@ -27056,7 +28412,7 @@
                     <a:graphicData uri="http://schemas.openxmlformats.org/drawingml/2006/picture">
                       <pic:pic xmlns:pic="http://schemas.openxmlformats.org/drawingml/2006/picture">
                         <pic:nvPicPr>
-                          <pic:cNvPr id="1008" name="" descr=""/>
+                          <pic:cNvPr id="0" name="" descr=""/>
                           <pic:cNvPicPr>
                             <a:picLocks noChangeAspect="1" noChangeArrowheads="1"/>
                           </pic:cNvPicPr>
@@ -27099,14 +28455,14 @@
         <w:keepLines/>
         <w:pageBreakBefore/>
       </w:pPr>
-      <w:bookmarkStart w:name="g_14" w:id="26"/>
+      <w:bookmarkStart w:name="g_14" w:id="27"/>
       <w:r>
         <w:rPr>
           <w:rFonts w:ascii="Arial" w:cs="Arial" w:eastAsia="Arial" w:hAnsi="Arial"/>
         </w:rPr>
         <w:t xml:space="preserve">Ranking — apontamento sobre os dias que já passaram (Rk1, T2)</w:t>
       </w:r>
-      <w:bookmarkEnd w:id="26"/>
+      <w:bookmarkEnd w:id="27"/>
     </w:p>
     <w:p>
       <w:pPr>
@@ -27232,7 +28588,7 @@
                 <wp:inline distT="0" distB="0" distL="0" distR="0">
                   <wp:extent cx="4476750" cy="2800350"/>
                   <wp:effectExtent t="0" r="0" b="0" l="0"/>
-                  <wp:docPr id="1009" name="ranking-apontamento-1440-light.jpg" descr="Antes — Ranking — apontamento sobre os dias que já passaram (Rk1, T2)" title="Antes — Ranking — apontamento sobre os dias que já passaram (Rk1, T2)"/>
+                  <wp:docPr id="9" name="ranking-apontamento-1440-light.jpg" descr="Antes — Ranking — apontamento sobre os dias que já passaram (Rk1, T2)" title="Antes — Ranking — apontamento sobre os dias que já passaram (Rk1, T2)"/>
                   <wp:cNvGraphicFramePr>
                     <a:graphicFrameLocks xmlns:a="http://schemas.openxmlformats.org/drawingml/2006/main" noChangeAspect="1"/>
                   </wp:cNvGraphicFramePr>
@@ -27240,7 +28596,7 @@
                     <a:graphicData uri="http://schemas.openxmlformats.org/drawingml/2006/picture">
                       <pic:pic xmlns:pic="http://schemas.openxmlformats.org/drawingml/2006/picture">
                         <pic:nvPicPr>
-                          <pic:cNvPr id="1009" name="" descr=""/>
+                          <pic:cNvPr id="0" name="" descr=""/>
                           <pic:cNvPicPr>
                             <a:picLocks noChangeAspect="1" noChangeArrowheads="1"/>
                           </pic:cNvPicPr>
@@ -27290,7 +28646,7 @@
                 <wp:inline distT="0" distB="0" distL="0" distR="0">
                   <wp:extent cx="4476750" cy="2800350"/>
                   <wp:effectExtent t="0" r="0" b="0" l="0"/>
-                  <wp:docPr id="1010" name="ranking-apontamento-1440-light.jpg" descr="Depois — Ranking — apontamento sobre os dias que já passaram (Rk1, T2)" title="Depois — Ranking — apontamento sobre os dias que já passaram (Rk1, T2)"/>
+                  <wp:docPr id="10" name="ranking-apontamento-1440-light.jpg" descr="Depois — Ranking — apontamento sobre os dias que já passaram (Rk1, T2)" title="Depois — Ranking — apontamento sobre os dias que já passaram (Rk1, T2)"/>
                   <wp:cNvGraphicFramePr>
                     <a:graphicFrameLocks xmlns:a="http://schemas.openxmlformats.org/drawingml/2006/main" noChangeAspect="1"/>
                   </wp:cNvGraphicFramePr>
@@ -27298,7 +28654,7 @@
                     <a:graphicData uri="http://schemas.openxmlformats.org/drawingml/2006/picture">
                       <pic:pic xmlns:pic="http://schemas.openxmlformats.org/drawingml/2006/picture">
                         <pic:nvPicPr>
-                          <pic:cNvPr id="1010" name="" descr=""/>
+                          <pic:cNvPr id="0" name="" descr=""/>
                           <pic:cNvPicPr>
                             <a:picLocks noChangeAspect="1" noChangeArrowheads="1"/>
                           </pic:cNvPicPr>
@@ -27341,14 +28697,14 @@
         <w:keepLines/>
         <w:pageBreakBefore/>
       </w:pPr>
-      <w:bookmarkStart w:name="g_17" w:id="27"/>
+      <w:bookmarkStart w:name="g_17" w:id="28"/>
       <w:r>
         <w:rPr>
           <w:rFonts w:ascii="Arial" w:cs="Arial" w:eastAsia="Arial" w:hAnsi="Arial"/>
         </w:rPr>
         <w:t xml:space="preserve">Relatórios — pré-visualização com os números do Dashboard (R1, R3, T1)</w:t>
       </w:r>
-      <w:bookmarkEnd w:id="27"/>
+      <w:bookmarkEnd w:id="28"/>
     </w:p>
     <w:tbl>
       <w:tblPr>
@@ -27460,7 +28816,7 @@
                 <wp:inline distT="0" distB="0" distL="0" distR="0">
                   <wp:extent cx="4476750" cy="2800350"/>
                   <wp:effectExtent t="0" r="0" b="0" l="0"/>
-                  <wp:docPr id="1011" name="relatorios-1440-light.jpg" descr="Antes — Relatórios — pré-visualização com os números do Dashboard (R1, R3, T1)" title="Antes — Relatórios — pré-visualização com os números do Dashboard (R1, R3, T1)"/>
+                  <wp:docPr id="11" name="relatorios-1440-light.jpg" descr="Antes — Relatórios — pré-visualização com os números do Dashboard (R1, R3, T1)" title="Antes — Relatórios — pré-visualização com os números do Dashboard (R1, R3, T1)"/>
                   <wp:cNvGraphicFramePr>
                     <a:graphicFrameLocks xmlns:a="http://schemas.openxmlformats.org/drawingml/2006/main" noChangeAspect="1"/>
                   </wp:cNvGraphicFramePr>
@@ -27468,7 +28824,7 @@
                     <a:graphicData uri="http://schemas.openxmlformats.org/drawingml/2006/picture">
                       <pic:pic xmlns:pic="http://schemas.openxmlformats.org/drawingml/2006/picture">
                         <pic:nvPicPr>
-                          <pic:cNvPr id="1011" name="" descr=""/>
+                          <pic:cNvPr id="0" name="" descr=""/>
                           <pic:cNvPicPr>
                             <a:picLocks noChangeAspect="1" noChangeArrowheads="1"/>
                           </pic:cNvPicPr>
@@ -27518,7 +28874,7 @@
                 <wp:inline distT="0" distB="0" distL="0" distR="0">
                   <wp:extent cx="4476750" cy="2800350"/>
                   <wp:effectExtent t="0" r="0" b="0" l="0"/>
-                  <wp:docPr id="1012" name="relatorios-1440-light.jpg" descr="Depois — Relatórios — pré-visualização com os números do Dashboard (R1, R3, T1)" title="Depois — Relatórios — pré-visualização com os números do Dashboard (R1, R3, T1)"/>
+                  <wp:docPr id="12" name="relatorios-1440-light.jpg" descr="Depois — Relatórios — pré-visualização com os números do Dashboard (R1, R3, T1)" title="Depois — Relatórios — pré-visualização com os números do Dashboard (R1, R3, T1)"/>
                   <wp:cNvGraphicFramePr>
                     <a:graphicFrameLocks xmlns:a="http://schemas.openxmlformats.org/drawingml/2006/main" noChangeAspect="1"/>
                   </wp:cNvGraphicFramePr>
@@ -27526,7 +28882,7 @@
                     <a:graphicData uri="http://schemas.openxmlformats.org/drawingml/2006/picture">
                       <pic:pic xmlns:pic="http://schemas.openxmlformats.org/drawingml/2006/picture">
                         <pic:nvPicPr>
-                          <pic:cNvPr id="1012" name="" descr=""/>
+                          <pic:cNvPr id="0" name="" descr=""/>
                           <pic:cNvPicPr>
                             <a:picLocks noChangeAspect="1" noChangeArrowheads="1"/>
                           </pic:cNvPicPr>
@@ -27569,14 +28925,14 @@
         <w:keepLines/>
         <w:pageBreakBefore/>
       </w:pPr>
-      <w:bookmarkStart w:name="g_19" w:id="28"/>
+      <w:bookmarkStart w:name="g_19" w:id="29"/>
       <w:r>
         <w:rPr>
           <w:rFonts w:ascii="Arial" w:cs="Arial" w:eastAsia="Arial" w:hAnsi="Arial"/>
         </w:rPr>
         <w:t xml:space="preserve">Layout</w:t>
       </w:r>
-      <w:bookmarkEnd w:id="28"/>
+      <w:bookmarkEnd w:id="29"/>
     </w:p>
     <w:p>
       <w:pPr>
@@ -27584,14 +28940,14 @@
         <w:keepNext/>
         <w:keepLines/>
       </w:pPr>
-      <w:bookmarkStart w:name="g_20" w:id="29"/>
+      <w:bookmarkStart w:name="g_20" w:id="30"/>
       <w:r>
         <w:rPr>
           <w:rFonts w:ascii="Arial" w:cs="Arial" w:eastAsia="Arial" w:hAnsi="Arial"/>
         </w:rPr>
         <w:t xml:space="preserve">KPIs em 1024px: 2 × 2 em vez de 3 + 1 (T3)</w:t>
       </w:r>
-      <w:bookmarkEnd w:id="29"/>
+      <w:bookmarkEnd w:id="30"/>
     </w:p>
     <w:tbl>
       <w:tblPr>
@@ -27703,7 +29059,7 @@
                 <wp:inline distT="0" distB="0" distL="0" distR="0">
                   <wp:extent cx="4343400" cy="4457700"/>
                   <wp:effectExtent t="0" r="0" b="0" l="0"/>
-                  <wp:docPr id="1013" name="dashboard-1024-light.jpg" descr="Antes — KPIs em 1024px: 2 × 2 em vez de 3 + 1 (T3)" title="Antes — KPIs em 1024px: 2 × 2 em vez de 3 + 1 (T3)"/>
+                  <wp:docPr id="13" name="dashboard-1024-light.jpg" descr="Antes — KPIs em 1024px: 2 × 2 em vez de 3 + 1 (T3)" title="Antes — KPIs em 1024px: 2 × 2 em vez de 3 + 1 (T3)"/>
                   <wp:cNvGraphicFramePr>
                     <a:graphicFrameLocks xmlns:a="http://schemas.openxmlformats.org/drawingml/2006/main" noChangeAspect="1"/>
                   </wp:cNvGraphicFramePr>
@@ -27711,7 +29067,7 @@
                     <a:graphicData uri="http://schemas.openxmlformats.org/drawingml/2006/picture">
                       <pic:pic xmlns:pic="http://schemas.openxmlformats.org/drawingml/2006/picture">
                         <pic:nvPicPr>
-                          <pic:cNvPr id="1013" name="" descr=""/>
+                          <pic:cNvPr id="0" name="" descr=""/>
                           <pic:cNvPicPr>
                             <a:picLocks noChangeAspect="1" noChangeArrowheads="1"/>
                           </pic:cNvPicPr>
@@ -27761,7 +29117,7 @@
                 <wp:inline distT="0" distB="0" distL="0" distR="0">
                   <wp:extent cx="4343400" cy="4419600"/>
                   <wp:effectExtent t="0" r="0" b="0" l="0"/>
-                  <wp:docPr id="1014" name="dashboard-1024-light.jpg" descr="Depois — KPIs em 1024px: 2 × 2 em vez de 3 + 1 (T3)" title="Depois — KPIs em 1024px: 2 × 2 em vez de 3 + 1 (T3)"/>
+                  <wp:docPr id="14" name="dashboard-1024-light.jpg" descr="Depois — KPIs em 1024px: 2 × 2 em vez de 3 + 1 (T3)" title="Depois — KPIs em 1024px: 2 × 2 em vez de 3 + 1 (T3)"/>
                   <wp:cNvGraphicFramePr>
                     <a:graphicFrameLocks xmlns:a="http://schemas.openxmlformats.org/drawingml/2006/main" noChangeAspect="1"/>
                   </wp:cNvGraphicFramePr>
@@ -27769,7 +29125,7 @@
                     <a:graphicData uri="http://schemas.openxmlformats.org/drawingml/2006/picture">
                       <pic:pic xmlns:pic="http://schemas.openxmlformats.org/drawingml/2006/picture">
                         <pic:nvPicPr>
-                          <pic:cNvPr id="1014" name="" descr=""/>
+                          <pic:cNvPr id="0" name="" descr=""/>
                           <pic:cNvPicPr>
                             <a:picLocks noChangeAspect="1" noChangeArrowheads="1"/>
                           </pic:cNvPicPr>
@@ -27812,14 +29168,14 @@
         <w:keepLines/>
         <w:pageBreakBefore/>
       </w:pPr>
-      <w:bookmarkStart w:name="g_22" w:id="30"/>
+      <w:bookmarkStart w:name="g_22" w:id="31"/>
       <w:r>
         <w:rPr>
           <w:rFonts w:ascii="Arial" w:cs="Arial" w:eastAsia="Arial" w:hAnsi="Arial"/>
         </w:rPr>
         <w:t xml:space="preserve">Painel aberto em 1440px (T3, T6)</w:t>
       </w:r>
-      <w:bookmarkEnd w:id="30"/>
+      <w:bookmarkEnd w:id="31"/>
     </w:p>
     <w:tbl>
       <w:tblPr>
@@ -27931,7 +29287,7 @@
                 <wp:inline distT="0" distB="0" distL="0" distR="0">
                   <wp:extent cx="4476750" cy="2800350"/>
                   <wp:effectExtent t="0" r="0" b="0" l="0"/>
-                  <wp:docPr id="1015" name="dashboard-painel-1440-light.jpg" descr="Antes — Painel aberto em 1440px (T3, T6)" title="Antes — Painel aberto em 1440px (T3, T6)"/>
+                  <wp:docPr id="15" name="dashboard-painel-1440-light.jpg" descr="Antes — Painel aberto em 1440px (T3, T6)" title="Antes — Painel aberto em 1440px (T3, T6)"/>
                   <wp:cNvGraphicFramePr>
                     <a:graphicFrameLocks xmlns:a="http://schemas.openxmlformats.org/drawingml/2006/main" noChangeAspect="1"/>
                   </wp:cNvGraphicFramePr>
@@ -27939,7 +29295,7 @@
                     <a:graphicData uri="http://schemas.openxmlformats.org/drawingml/2006/picture">
                       <pic:pic xmlns:pic="http://schemas.openxmlformats.org/drawingml/2006/picture">
                         <pic:nvPicPr>
-                          <pic:cNvPr id="1015" name="" descr=""/>
+                          <pic:cNvPr id="0" name="" descr=""/>
                           <pic:cNvPicPr>
                             <a:picLocks noChangeAspect="1" noChangeArrowheads="1"/>
                           </pic:cNvPicPr>
@@ -27989,7 +29345,7 @@
                 <wp:inline distT="0" distB="0" distL="0" distR="0">
                   <wp:extent cx="4476750" cy="2800350"/>
                   <wp:effectExtent t="0" r="0" b="0" l="0"/>
-                  <wp:docPr id="1016" name="dashboard-painel-1440-light.jpg" descr="Depois — Painel aberto em 1440px (T3, T6)" title="Depois — Painel aberto em 1440px (T3, T6)"/>
+                  <wp:docPr id="16" name="dashboard-painel-1440-light.jpg" descr="Depois — Painel aberto em 1440px (T3, T6)" title="Depois — Painel aberto em 1440px (T3, T6)"/>
                   <wp:cNvGraphicFramePr>
                     <a:graphicFrameLocks xmlns:a="http://schemas.openxmlformats.org/drawingml/2006/main" noChangeAspect="1"/>
                   </wp:cNvGraphicFramePr>
@@ -27997,7 +29353,7 @@
                     <a:graphicData uri="http://schemas.openxmlformats.org/drawingml/2006/picture">
                       <pic:pic xmlns:pic="http://schemas.openxmlformats.org/drawingml/2006/picture">
                         <pic:nvPicPr>
-                          <pic:cNvPr id="1016" name="" descr=""/>
+                          <pic:cNvPr id="0" name="" descr=""/>
                           <pic:cNvPicPr>
                             <a:picLocks noChangeAspect="1" noChangeArrowheads="1"/>
                           </pic:cNvPicPr>
@@ -28040,14 +29396,14 @@
         <w:keepLines/>
         <w:pageBreakBefore/>
       </w:pPr>
-      <w:bookmarkStart w:name="g_24" w:id="31"/>
+      <w:bookmarkStart w:name="g_24" w:id="32"/>
       <w:r>
         <w:rPr>
           <w:rFonts w:ascii="Arial" w:cs="Arial" w:eastAsia="Arial" w:hAnsi="Arial"/>
         </w:rPr>
         <w:t xml:space="preserve">Estado vazio no celular (T4)</w:t>
       </w:r>
-      <w:bookmarkEnd w:id="31"/>
+      <w:bookmarkEnd w:id="32"/>
     </w:p>
     <w:tbl>
       <w:tblPr>
@@ -28159,7 +29515,7 @@
                 <wp:inline distT="0" distB="0" distL="0" distR="0">
                   <wp:extent cx="2000250" cy="4829175"/>
                   <wp:effectExtent t="0" r="0" b="0" l="0"/>
-                  <wp:docPr id="1017" name="dashboard-vazio-390-light.jpg" descr="Antes — Estado vazio no celular (T4)" title="Antes — Estado vazio no celular (T4)"/>
+                  <wp:docPr id="17" name="dashboard-vazio-390-light.jpg" descr="Antes — Estado vazio no celular (T4)" title="Antes — Estado vazio no celular (T4)"/>
                   <wp:cNvGraphicFramePr>
                     <a:graphicFrameLocks xmlns:a="http://schemas.openxmlformats.org/drawingml/2006/main" noChangeAspect="1"/>
                   </wp:cNvGraphicFramePr>
@@ -28167,7 +29523,7 @@
                     <a:graphicData uri="http://schemas.openxmlformats.org/drawingml/2006/picture">
                       <pic:pic xmlns:pic="http://schemas.openxmlformats.org/drawingml/2006/picture">
                         <pic:nvPicPr>
-                          <pic:cNvPr id="1017" name="" descr=""/>
+                          <pic:cNvPr id="0" name="" descr=""/>
                           <pic:cNvPicPr>
                             <a:picLocks noChangeAspect="1" noChangeArrowheads="1"/>
                           </pic:cNvPicPr>
@@ -28217,7 +29573,7 @@
                 <wp:inline distT="0" distB="0" distL="0" distR="0">
                   <wp:extent cx="2000250" cy="5019675"/>
                   <wp:effectExtent t="0" r="0" b="0" l="0"/>
-                  <wp:docPr id="1018" name="dashboard-vazio-390-light.jpg" descr="Depois — Estado vazio no celular (T4)" title="Depois — Estado vazio no celular (T4)"/>
+                  <wp:docPr id="18" name="dashboard-vazio-390-light.jpg" descr="Depois — Estado vazio no celular (T4)" title="Depois — Estado vazio no celular (T4)"/>
                   <wp:cNvGraphicFramePr>
                     <a:graphicFrameLocks xmlns:a="http://schemas.openxmlformats.org/drawingml/2006/main" noChangeAspect="1"/>
                   </wp:cNvGraphicFramePr>
@@ -28225,7 +29581,7 @@
                     <a:graphicData uri="http://schemas.openxmlformats.org/drawingml/2006/picture">
                       <pic:pic xmlns:pic="http://schemas.openxmlformats.org/drawingml/2006/picture">
                         <pic:nvPicPr>
-                          <pic:cNvPr id="1018" name="" descr=""/>
+                          <pic:cNvPr id="0" name="" descr=""/>
                           <pic:cNvPicPr>
                             <a:picLocks noChangeAspect="1" noChangeArrowheads="1"/>
                           </pic:cNvPicPr>
@@ -28268,14 +29624,14 @@
         <w:keepLines/>
         <w:pageBreakBefore/>
       </w:pPr>
-      <w:bookmarkStart w:name="g_26" w:id="32"/>
+      <w:bookmarkStart w:name="g_26" w:id="33"/>
       <w:r>
         <w:rPr>
           <w:rFonts w:ascii="Arial" w:cs="Arial" w:eastAsia="Arial" w:hAnsi="Arial"/>
         </w:rPr>
         <w:t xml:space="preserve">Cadastro de máquinas no celular: sem rolagem lateral da página (C1)</w:t>
       </w:r>
-      <w:bookmarkEnd w:id="32"/>
+      <w:bookmarkEnd w:id="33"/>
     </w:p>
     <w:tbl>
       <w:tblPr>
@@ -28387,7 +29743,7 @@
                 <wp:inline distT="0" distB="0" distL="0" distR="0">
                   <wp:extent cx="2171700" cy="3419475"/>
                   <wp:effectExtent t="0" r="0" b="0" l="0"/>
-                  <wp:docPr id="1019" name="cadastro-maquinas-390-light.jpg" descr="Antes — Cadastro de máquinas no celular: sem rolagem lateral da página (C1)" title="Antes — Cadastro de máquinas no celular: sem rolagem lateral da página (C1)"/>
+                  <wp:docPr id="19" name="cadastro-maquinas-390-light.jpg" descr="Antes — Cadastro de máquinas no celular: sem rolagem lateral da página (C1)" title="Antes — Cadastro de máquinas no celular: sem rolagem lateral da página (C1)"/>
                   <wp:cNvGraphicFramePr>
                     <a:graphicFrameLocks xmlns:a="http://schemas.openxmlformats.org/drawingml/2006/main" noChangeAspect="1"/>
                   </wp:cNvGraphicFramePr>
@@ -28395,7 +29751,7 @@
                     <a:graphicData uri="http://schemas.openxmlformats.org/drawingml/2006/picture">
                       <pic:pic xmlns:pic="http://schemas.openxmlformats.org/drawingml/2006/picture">
                         <pic:nvPicPr>
-                          <pic:cNvPr id="1019" name="" descr=""/>
+                          <pic:cNvPr id="0" name="" descr=""/>
                           <pic:cNvPicPr>
                             <a:picLocks noChangeAspect="1" noChangeArrowheads="1"/>
                           </pic:cNvPicPr>
@@ -28445,7 +29801,7 @@
                 <wp:inline distT="0" distB="0" distL="0" distR="0">
                   <wp:extent cx="2171700" cy="5010150"/>
                   <wp:effectExtent t="0" r="0" b="0" l="0"/>
-                  <wp:docPr id="1020" name="cadastro-maquinas-390-light.jpg" descr="Depois — Cadastro de máquinas no celular: sem rolagem lateral da página (C1)" title="Depois — Cadastro de máquinas no celular: sem rolagem lateral da página (C1)"/>
+                  <wp:docPr id="20" name="cadastro-maquinas-390-light.jpg" descr="Depois — Cadastro de máquinas no celular: sem rolagem lateral da página (C1)" title="Depois — Cadastro de máquinas no celular: sem rolagem lateral da página (C1)"/>
                   <wp:cNvGraphicFramePr>
                     <a:graphicFrameLocks xmlns:a="http://schemas.openxmlformats.org/drawingml/2006/main" noChangeAspect="1"/>
                   </wp:cNvGraphicFramePr>
@@ -28453,7 +29809,7 @@
                     <a:graphicData uri="http://schemas.openxmlformats.org/drawingml/2006/picture">
                       <pic:pic xmlns:pic="http://schemas.openxmlformats.org/drawingml/2006/picture">
                         <pic:nvPicPr>
-                          <pic:cNvPr id="1020" name="" descr=""/>
+                          <pic:cNvPr id="0" name="" descr=""/>
                           <pic:cNvPicPr>
                             <a:picLocks noChangeAspect="1" noChangeArrowheads="1"/>
                           </pic:cNvPicPr>
@@ -28496,14 +29852,14 @@
         <w:keepLines/>
         <w:pageBreakBefore/>
       </w:pPr>
-      <w:bookmarkStart w:name="g_28" w:id="33"/>
+      <w:bookmarkStart w:name="g_28" w:id="34"/>
       <w:r>
         <w:rPr>
           <w:rFonts w:ascii="Arial" w:cs="Arial" w:eastAsia="Arial" w:hAnsi="Arial"/>
         </w:rPr>
         <w:t xml:space="preserve">Retrabalho no celular: as barras voltam (Rw1, Rw2)</w:t>
       </w:r>
-      <w:bookmarkEnd w:id="33"/>
+      <w:bookmarkEnd w:id="34"/>
     </w:p>
     <w:tbl>
       <w:tblPr>
@@ -28615,7 +29971,7 @@
                 <wp:inline distT="0" distB="0" distL="0" distR="0">
                   <wp:extent cx="1771650" cy="5000625"/>
                   <wp:effectExtent t="0" r="0" b="0" l="0"/>
-                  <wp:docPr id="1021" name="retrabalho-390-light.jpg" descr="Antes — Retrabalho no celular: as barras voltam (Rw1, Rw2)" title="Antes — Retrabalho no celular: as barras voltam (Rw1, Rw2)"/>
+                  <wp:docPr id="21" name="retrabalho-390-light.jpg" descr="Antes — Retrabalho no celular: as barras voltam (Rw1, Rw2)" title="Antes — Retrabalho no celular: as barras voltam (Rw1, Rw2)"/>
                   <wp:cNvGraphicFramePr>
                     <a:graphicFrameLocks xmlns:a="http://schemas.openxmlformats.org/drawingml/2006/main" noChangeAspect="1"/>
                   </wp:cNvGraphicFramePr>
@@ -28623,7 +29979,7 @@
                     <a:graphicData uri="http://schemas.openxmlformats.org/drawingml/2006/picture">
                       <pic:pic xmlns:pic="http://schemas.openxmlformats.org/drawingml/2006/picture">
                         <pic:nvPicPr>
-                          <pic:cNvPr id="1021" name="" descr=""/>
+                          <pic:cNvPr id="0" name="" descr=""/>
                           <pic:cNvPicPr>
                             <a:picLocks noChangeAspect="1" noChangeArrowheads="1"/>
                           </pic:cNvPicPr>
@@ -28673,7 +30029,7 @@
                 <wp:inline distT="0" distB="0" distL="0" distR="0">
                   <wp:extent cx="1771650" cy="5000625"/>
                   <wp:effectExtent t="0" r="0" b="0" l="0"/>
-                  <wp:docPr id="1022" name="retrabalho-390-light.jpg" descr="Depois — Retrabalho no celular: as barras voltam (Rw1, Rw2)" title="Depois — Retrabalho no celular: as barras voltam (Rw1, Rw2)"/>
+                  <wp:docPr id="22" name="retrabalho-390-light.jpg" descr="Depois — Retrabalho no celular: as barras voltam (Rw1, Rw2)" title="Depois — Retrabalho no celular: as barras voltam (Rw1, Rw2)"/>
                   <wp:cNvGraphicFramePr>
                     <a:graphicFrameLocks xmlns:a="http://schemas.openxmlformats.org/drawingml/2006/main" noChangeAspect="1"/>
                   </wp:cNvGraphicFramePr>
@@ -28681,7 +30037,7 @@
                     <a:graphicData uri="http://schemas.openxmlformats.org/drawingml/2006/picture">
                       <pic:pic xmlns:pic="http://schemas.openxmlformats.org/drawingml/2006/picture">
                         <pic:nvPicPr>
-                          <pic:cNvPr id="1022" name="" descr=""/>
+                          <pic:cNvPr id="0" name="" descr=""/>
                           <pic:cNvPicPr>
                             <a:picLocks noChangeAspect="1" noChangeArrowheads="1"/>
                           </pic:cNvPicPr>
@@ -28724,14 +30080,14 @@
         <w:keepLines/>
         <w:pageBreakBefore/>
       </w:pPr>
-      <w:bookmarkStart w:name="g_30" w:id="34"/>
+      <w:bookmarkStart w:name="g_30" w:id="35"/>
       <w:r>
         <w:rPr>
           <w:rFonts w:ascii="Arial" w:cs="Arial" w:eastAsia="Arial" w:hAnsi="Arial"/>
         </w:rPr>
         <w:t xml:space="preserve">Gráficos no celular: rótulos do Pareto e nomes das máquinas (M10, M11)</w:t>
       </w:r>
-      <w:bookmarkEnd w:id="34"/>
+      <w:bookmarkEnd w:id="35"/>
     </w:p>
     <w:tbl>
       <w:tblPr>
@@ -28843,7 +30199,7 @@
                 <wp:inline distT="0" distB="0" distL="0" distR="0">
                   <wp:extent cx="2571750" cy="5010150"/>
                   <wp:effectExtent t="0" r="0" b="0" l="0"/>
-                  <wp:docPr id="1023" name="dashboard-graficos-390-pareto.jpg" descr="Antes — Gráficos no celular: rótulos do Pareto e nomes das máquinas (M10, M11)" title="Antes — Gráficos no celular: rótulos do Pareto e nomes das máquinas (M10, M11)"/>
+                  <wp:docPr id="23" name="dashboard-graficos-390-pareto.jpg" descr="Antes — Gráficos no celular: rótulos do Pareto e nomes das máquinas (M10, M11)" title="Antes — Gráficos no celular: rótulos do Pareto e nomes das máquinas (M10, M11)"/>
                   <wp:cNvGraphicFramePr>
                     <a:graphicFrameLocks xmlns:a="http://schemas.openxmlformats.org/drawingml/2006/main" noChangeAspect="1"/>
                   </wp:cNvGraphicFramePr>
@@ -28851,7 +30207,7 @@
                     <a:graphicData uri="http://schemas.openxmlformats.org/drawingml/2006/picture">
                       <pic:pic xmlns:pic="http://schemas.openxmlformats.org/drawingml/2006/picture">
                         <pic:nvPicPr>
-                          <pic:cNvPr id="1023" name="" descr=""/>
+                          <pic:cNvPr id="0" name="" descr=""/>
                           <pic:cNvPicPr>
                             <a:picLocks noChangeAspect="1" noChangeArrowheads="1"/>
                           </pic:cNvPicPr>
@@ -28901,7 +30257,7 @@
                 <wp:inline distT="0" distB="0" distL="0" distR="0">
                   <wp:extent cx="2571750" cy="5010150"/>
                   <wp:effectExtent t="0" r="0" b="0" l="0"/>
-                  <wp:docPr id="1024" name="dashboard-graficos-390-pareto.jpg" descr="Depois — Gráficos no celular: rótulos do Pareto e nomes das máquinas (M10, M11)" title="Depois — Gráficos no celular: rótulos do Pareto e nomes das máquinas (M10, M11)"/>
+                  <wp:docPr id="24" name="dashboard-graficos-390-pareto.jpg" descr="Depois — Gráficos no celular: rótulos do Pareto e nomes das máquinas (M10, M11)" title="Depois — Gráficos no celular: rótulos do Pareto e nomes das máquinas (M10, M11)"/>
                   <wp:cNvGraphicFramePr>
                     <a:graphicFrameLocks xmlns:a="http://schemas.openxmlformats.org/drawingml/2006/main" noChangeAspect="1"/>
                   </wp:cNvGraphicFramePr>
@@ -28909,7 +30265,7 @@
                     <a:graphicData uri="http://schemas.openxmlformats.org/drawingml/2006/picture">
                       <pic:pic xmlns:pic="http://schemas.openxmlformats.org/drawingml/2006/picture">
                         <pic:nvPicPr>
-                          <pic:cNvPr id="1024" name="" descr=""/>
+                          <pic:cNvPr id="0" name="" descr=""/>
                           <pic:cNvPicPr>
                             <a:picLocks noChangeAspect="1" noChangeArrowheads="1"/>
                           </pic:cNvPicPr>
@@ -29068,7 +30424,7 @@
                 <wp:inline distT="0" distB="0" distL="0" distR="0">
                   <wp:extent cx="2905125" cy="5210175"/>
                   <wp:effectExtent t="0" r="0" b="0" l="0"/>
-                  <wp:docPr id="1025" name="dashboard-graficos-390-atingimento.jpg" descr="Antes — Gráficos no celular: rótulos do Pareto e nomes das máquinas (M10, M11)" title="Antes — Gráficos no celular: rótulos do Pareto e nomes das máquinas (M10, M11)"/>
+                  <wp:docPr id="25" name="dashboard-graficos-390-atingimento.jpg" descr="Antes — Gráficos no celular: rótulos do Pareto e nomes das máquinas (M10, M11)" title="Antes — Gráficos no celular: rótulos do Pareto e nomes das máquinas (M10, M11)"/>
                   <wp:cNvGraphicFramePr>
                     <a:graphicFrameLocks xmlns:a="http://schemas.openxmlformats.org/drawingml/2006/main" noChangeAspect="1"/>
                   </wp:cNvGraphicFramePr>
@@ -29076,7 +30432,7 @@
                     <a:graphicData uri="http://schemas.openxmlformats.org/drawingml/2006/picture">
                       <pic:pic xmlns:pic="http://schemas.openxmlformats.org/drawingml/2006/picture">
                         <pic:nvPicPr>
-                          <pic:cNvPr id="1025" name="" descr=""/>
+                          <pic:cNvPr id="0" name="" descr=""/>
                           <pic:cNvPicPr>
                             <a:picLocks noChangeAspect="1" noChangeArrowheads="1"/>
                           </pic:cNvPicPr>
@@ -29126,7 +30482,7 @@
                 <wp:inline distT="0" distB="0" distL="0" distR="0">
                   <wp:extent cx="2905125" cy="5210175"/>
                   <wp:effectExtent t="0" r="0" b="0" l="0"/>
-                  <wp:docPr id="1026" name="dashboard-graficos-390-atingimento.jpg" descr="Depois — Gráficos no celular: rótulos do Pareto e nomes das máquinas (M10, M11)" title="Depois — Gráficos no celular: rótulos do Pareto e nomes das máquinas (M10, M11)"/>
+                  <wp:docPr id="26" name="dashboard-graficos-390-atingimento.jpg" descr="Depois — Gráficos no celular: rótulos do Pareto e nomes das máquinas (M10, M11)" title="Depois — Gráficos no celular: rótulos do Pareto e nomes das máquinas (M10, M11)"/>
                   <wp:cNvGraphicFramePr>
                     <a:graphicFrameLocks xmlns:a="http://schemas.openxmlformats.org/drawingml/2006/main" noChangeAspect="1"/>
                   </wp:cNvGraphicFramePr>
@@ -29134,7 +30490,7 @@
                     <a:graphicData uri="http://schemas.openxmlformats.org/drawingml/2006/picture">
                       <pic:pic xmlns:pic="http://schemas.openxmlformats.org/drawingml/2006/picture">
                         <pic:nvPicPr>
-                          <pic:cNvPr id="1026" name="" descr=""/>
+                          <pic:cNvPr id="0" name="" descr=""/>
                           <pic:cNvPicPr>
                             <a:picLocks noChangeAspect="1" noChangeArrowheads="1"/>
                           </pic:cNvPicPr>
@@ -29177,14 +30533,14 @@
         <w:keepLines/>
         <w:pageBreakBefore/>
       </w:pPr>
-      <w:bookmarkStart w:name="g_32" w:id="35"/>
+      <w:bookmarkStart w:name="g_32" w:id="36"/>
       <w:r>
         <w:rPr>
           <w:rFonts w:ascii="Arial" w:cs="Arial" w:eastAsia="Arial" w:hAnsi="Arial"/>
         </w:rPr>
         <w:t xml:space="preserve">OPs: busca inteira, sem rodapé vazio, "Concluídas no mês" do mês (O1, O2, T5)</w:t>
       </w:r>
-      <w:bookmarkEnd w:id="35"/>
+      <w:bookmarkEnd w:id="36"/>
     </w:p>
     <w:tbl>
       <w:tblPr>
@@ -29296,7 +30652,7 @@
                 <wp:inline distT="0" distB="0" distL="0" distR="0">
                   <wp:extent cx="4476750" cy="2181225"/>
                   <wp:effectExtent t="0" r="0" b="0" l="0"/>
-                  <wp:docPr id="1027" name="ops-1440-light.jpg" descr="Antes — OPs: busca inteira, sem rodapé vazio, &quot;Concluídas no mês&quot; do mês (O1, O2, T5)" title="Antes — OPs: busca inteira, sem rodapé vazio, &quot;Concluídas no mês&quot; do mês (O1, O2, T5)"/>
+                  <wp:docPr id="27" name="ops-1440-light.jpg" descr="Antes — OPs: busca inteira, sem rodapé vazio, &quot;Concluídas no mês&quot; do mês (O1, O2, T5)" title="Antes — OPs: busca inteira, sem rodapé vazio, &quot;Concluídas no mês&quot; do mês (O1, O2, T5)"/>
                   <wp:cNvGraphicFramePr>
                     <a:graphicFrameLocks xmlns:a="http://schemas.openxmlformats.org/drawingml/2006/main" noChangeAspect="1"/>
                   </wp:cNvGraphicFramePr>
@@ -29304,7 +30660,7 @@
                     <a:graphicData uri="http://schemas.openxmlformats.org/drawingml/2006/picture">
                       <pic:pic xmlns:pic="http://schemas.openxmlformats.org/drawingml/2006/picture">
                         <pic:nvPicPr>
-                          <pic:cNvPr id="1027" name="" descr=""/>
+                          <pic:cNvPr id="0" name="" descr=""/>
                           <pic:cNvPicPr>
                             <a:picLocks noChangeAspect="1" noChangeArrowheads="1"/>
                           </pic:cNvPicPr>
@@ -29354,7 +30710,7 @@
                 <wp:inline distT="0" distB="0" distL="0" distR="0">
                   <wp:extent cx="4476750" cy="2181225"/>
                   <wp:effectExtent t="0" r="0" b="0" l="0"/>
-                  <wp:docPr id="1028" name="ops-1440-light.jpg" descr="Depois — OPs: busca inteira, sem rodapé vazio, &quot;Concluídas no mês&quot; do mês (O1, O2, T5)" title="Depois — OPs: busca inteira, sem rodapé vazio, &quot;Concluídas no mês&quot; do mês (O1, O2, T5)"/>
+                  <wp:docPr id="28" name="ops-1440-light.jpg" descr="Depois — OPs: busca inteira, sem rodapé vazio, &quot;Concluídas no mês&quot; do mês (O1, O2, T5)" title="Depois — OPs: busca inteira, sem rodapé vazio, &quot;Concluídas no mês&quot; do mês (O1, O2, T5)"/>
                   <wp:cNvGraphicFramePr>
                     <a:graphicFrameLocks xmlns:a="http://schemas.openxmlformats.org/drawingml/2006/main" noChangeAspect="1"/>
                   </wp:cNvGraphicFramePr>
@@ -29362,7 +30718,7 @@
                     <a:graphicData uri="http://schemas.openxmlformats.org/drawingml/2006/picture">
                       <pic:pic xmlns:pic="http://schemas.openxmlformats.org/drawingml/2006/picture">
                         <pic:nvPicPr>
-                          <pic:cNvPr id="1028" name="" descr=""/>
+                          <pic:cNvPr id="0" name="" descr=""/>
                           <pic:cNvPicPr>
                             <a:picLocks noChangeAspect="1" noChangeArrowheads="1"/>
                           </pic:cNvPicPr>
@@ -29405,14 +30761,14 @@
         <w:keepLines/>
         <w:pageBreakBefore/>
       </w:pPr>
-      <w:bookmarkStart w:name="g_34" w:id="36"/>
+      <w:bookmarkStart w:name="g_34" w:id="37"/>
       <w:r>
         <w:rPr>
           <w:rFonts w:ascii="Arial" w:cs="Arial" w:eastAsia="Arial" w:hAnsi="Arial"/>
         </w:rPr>
         <w:t xml:space="preserve">Metas: "102%" cabe na caixa (M9)</w:t>
       </w:r>
-      <w:bookmarkEnd w:id="36"/>
+      <w:bookmarkEnd w:id="37"/>
     </w:p>
     <w:tbl>
       <w:tblPr>
@@ -29524,7 +30880,7 @@
                 <wp:inline distT="0" distB="0" distL="0" distR="0">
                   <wp:extent cx="4476750" cy="2800350"/>
                   <wp:effectExtent t="0" r="0" b="0" l="0"/>
-                  <wp:docPr id="1029" name="metas-1440-light.jpg" descr="Antes — Metas: &quot;102%&quot; cabe na caixa (M9)" title="Antes — Metas: &quot;102%&quot; cabe na caixa (M9)"/>
+                  <wp:docPr id="29" name="metas-1440-light.jpg" descr="Antes — Metas: &quot;102%&quot; cabe na caixa (M9)" title="Antes — Metas: &quot;102%&quot; cabe na caixa (M9)"/>
                   <wp:cNvGraphicFramePr>
                     <a:graphicFrameLocks xmlns:a="http://schemas.openxmlformats.org/drawingml/2006/main" noChangeAspect="1"/>
                   </wp:cNvGraphicFramePr>
@@ -29532,7 +30888,7 @@
                     <a:graphicData uri="http://schemas.openxmlformats.org/drawingml/2006/picture">
                       <pic:pic xmlns:pic="http://schemas.openxmlformats.org/drawingml/2006/picture">
                         <pic:nvPicPr>
-                          <pic:cNvPr id="1029" name="" descr=""/>
+                          <pic:cNvPr id="0" name="" descr=""/>
                           <pic:cNvPicPr>
                             <a:picLocks noChangeAspect="1" noChangeArrowheads="1"/>
                           </pic:cNvPicPr>
@@ -29582,7 +30938,7 @@
                 <wp:inline distT="0" distB="0" distL="0" distR="0">
                   <wp:extent cx="4476750" cy="2800350"/>
                   <wp:effectExtent t="0" r="0" b="0" l="0"/>
-                  <wp:docPr id="1030" name="metas-1440-light.jpg" descr="Depois — Metas: &quot;102%&quot; cabe na caixa (M9)" title="Depois — Metas: &quot;102%&quot; cabe na caixa (M9)"/>
+                  <wp:docPr id="30" name="metas-1440-light.jpg" descr="Depois — Metas: &quot;102%&quot; cabe na caixa (M9)" title="Depois — Metas: &quot;102%&quot; cabe na caixa (M9)"/>
                   <wp:cNvGraphicFramePr>
                     <a:graphicFrameLocks xmlns:a="http://schemas.openxmlformats.org/drawingml/2006/main" noChangeAspect="1"/>
                   </wp:cNvGraphicFramePr>
@@ -29590,7 +30946,7 @@
                     <a:graphicData uri="http://schemas.openxmlformats.org/drawingml/2006/picture">
                       <pic:pic xmlns:pic="http://schemas.openxmlformats.org/drawingml/2006/picture">
                         <pic:nvPicPr>
-                          <pic:cNvPr id="1030" name="" descr=""/>
+                          <pic:cNvPr id="0" name="" descr=""/>
                           <pic:cNvPicPr>
                             <a:picLocks noChangeAspect="1" noChangeArrowheads="1"/>
                           </pic:cNvPicPr>
@@ -29633,14 +30989,14 @@
         <w:keepLines/>
         <w:pageBreakBefore/>
       </w:pPr>
-      <w:bookmarkStart w:name="g_36" w:id="37"/>
+      <w:bookmarkStart w:name="g_36" w:id="38"/>
       <w:r>
         <w:rPr>
           <w:rFonts w:ascii="Arial" w:cs="Arial" w:eastAsia="Arial" w:hAnsi="Arial"/>
         </w:rPr>
         <w:t xml:space="preserve">Modo TV: "Dados até…" ao lado do relógio (TV1)</w:t>
       </w:r>
-      <w:bookmarkEnd w:id="37"/>
+      <w:bookmarkEnd w:id="38"/>
     </w:p>
     <w:tbl>
       <w:tblPr>
@@ -29752,7 +31108,7 @@
                 <wp:inline distT="0" distB="0" distL="0" distR="0">
                   <wp:extent cx="4476750" cy="2514600"/>
                   <wp:effectExtent t="0" r="0" b="0" l="0"/>
-                  <wp:docPr id="1031" name="tv-slide1-1920.jpg" descr="Antes — Modo TV: &quot;Dados até…&quot; ao lado do relógio (TV1)" title="Antes — Modo TV: &quot;Dados até…&quot; ao lado do relógio (TV1)"/>
+                  <wp:docPr id="31" name="tv-slide1-1920.jpg" descr="Antes — Modo TV: &quot;Dados até…&quot; ao lado do relógio (TV1)" title="Antes — Modo TV: &quot;Dados até…&quot; ao lado do relógio (TV1)"/>
                   <wp:cNvGraphicFramePr>
                     <a:graphicFrameLocks xmlns:a="http://schemas.openxmlformats.org/drawingml/2006/main" noChangeAspect="1"/>
                   </wp:cNvGraphicFramePr>
@@ -29760,7 +31116,7 @@
                     <a:graphicData uri="http://schemas.openxmlformats.org/drawingml/2006/picture">
                       <pic:pic xmlns:pic="http://schemas.openxmlformats.org/drawingml/2006/picture">
                         <pic:nvPicPr>
-                          <pic:cNvPr id="1031" name="" descr=""/>
+                          <pic:cNvPr id="0" name="" descr=""/>
                           <pic:cNvPicPr>
                             <a:picLocks noChangeAspect="1" noChangeArrowheads="1"/>
                           </pic:cNvPicPr>
@@ -29810,7 +31166,7 @@
                 <wp:inline distT="0" distB="0" distL="0" distR="0">
                   <wp:extent cx="4476750" cy="2514600"/>
                   <wp:effectExtent t="0" r="0" b="0" l="0"/>
-                  <wp:docPr id="1032" name="tv-slide1-1920.jpg" descr="Depois — Modo TV: &quot;Dados até…&quot; ao lado do relógio (TV1)" title="Depois — Modo TV: &quot;Dados até…&quot; ao lado do relógio (TV1)"/>
+                  <wp:docPr id="32" name="tv-slide1-1920.jpg" descr="Depois — Modo TV: &quot;Dados até…&quot; ao lado do relógio (TV1)" title="Depois — Modo TV: &quot;Dados até…&quot; ao lado do relógio (TV1)"/>
                   <wp:cNvGraphicFramePr>
                     <a:graphicFrameLocks xmlns:a="http://schemas.openxmlformats.org/drawingml/2006/main" noChangeAspect="1"/>
                   </wp:cNvGraphicFramePr>
@@ -29818,7 +31174,7 @@
                     <a:graphicData uri="http://schemas.openxmlformats.org/drawingml/2006/picture">
                       <pic:pic xmlns:pic="http://schemas.openxmlformats.org/drawingml/2006/picture">
                         <pic:nvPicPr>
-                          <pic:cNvPr id="1032" name="" descr=""/>
+                          <pic:cNvPr id="0" name="" descr=""/>
                           <pic:cNvPicPr>
                             <a:picLocks noChangeAspect="1" noChangeArrowheads="1"/>
                           </pic:cNvPicPr>
@@ -29861,14 +31217,14 @@
         <w:keepLines/>
         <w:pageBreakBefore/>
       </w:pPr>
-      <w:bookmarkStart w:name="g_38" w:id="38"/>
+      <w:bookmarkStart w:name="g_38" w:id="39"/>
       <w:r>
         <w:rPr>
           <w:rFonts w:ascii="Arial" w:cs="Arial" w:eastAsia="Arial" w:hAnsi="Arial"/>
         </w:rPr>
         <w:t xml:space="preserve">Ainda como antes (aguardam decisão)</w:t>
       </w:r>
-      <w:bookmarkEnd w:id="38"/>
+      <w:bookmarkEnd w:id="39"/>
     </w:p>
     <w:p>
       <w:pPr>
@@ -29941,7 +31297,7 @@
                 <wp:inline distT="0" distB="0" distL="0" distR="0">
                   <wp:extent cx="3314700" cy="2162175"/>
                   <wp:effectExtent t="0" r="0" b="0" l="0"/>
-                  <wp:docPr id="1033" name="dashboard-1440-light.jpg" descr="dashboard-1440-light.jpg" title="dashboard-1440-light.jpg"/>
+                  <wp:docPr id="33" name="dashboard-1440-light.jpg" descr="dashboard-1440-light.jpg" title="dashboard-1440-light.jpg"/>
                   <wp:cNvGraphicFramePr>
                     <a:graphicFrameLocks xmlns:a="http://schemas.openxmlformats.org/drawingml/2006/main" noChangeAspect="1"/>
                   </wp:cNvGraphicFramePr>
@@ -29949,7 +31305,7 @@
                     <a:graphicData uri="http://schemas.openxmlformats.org/drawingml/2006/picture">
                       <pic:pic xmlns:pic="http://schemas.openxmlformats.org/drawingml/2006/picture">
                         <pic:nvPicPr>
-                          <pic:cNvPr id="1033" name="" descr=""/>
+                          <pic:cNvPr id="0" name="" descr=""/>
                           <pic:cNvPicPr>
                             <a:picLocks noChangeAspect="1" noChangeArrowheads="1"/>
                           </pic:cNvPicPr>
@@ -30075,7 +31431,7 @@
                 <wp:inline distT="0" distB="0" distL="0" distR="0">
                   <wp:extent cx="3448050" cy="2152650"/>
                   <wp:effectExtent t="0" r="0" b="0" l="0"/>
-                  <wp:docPr id="1034" name="dashboard-erro-1440-light.jpg" descr="dashboard-erro-1440-light.jpg" title="dashboard-erro-1440-light.jpg"/>
+                  <wp:docPr id="34" name="dashboard-erro-1440-light.jpg" descr="dashboard-erro-1440-light.jpg" title="dashboard-erro-1440-light.jpg"/>
                   <wp:cNvGraphicFramePr>
                     <a:graphicFrameLocks xmlns:a="http://schemas.openxmlformats.org/drawingml/2006/main" noChangeAspect="1"/>
                   </wp:cNvGraphicFramePr>
@@ -30083,7 +31439,7 @@
                     <a:graphicData uri="http://schemas.openxmlformats.org/drawingml/2006/picture">
                       <pic:pic xmlns:pic="http://schemas.openxmlformats.org/drawingml/2006/picture">
                         <pic:nvPicPr>
-                          <pic:cNvPr id="1034" name="" descr=""/>
+                          <pic:cNvPr id="0" name="" descr=""/>
                           <pic:cNvPicPr>
                             <a:picLocks noChangeAspect="1" noChangeArrowheads="1"/>
                           </pic:cNvPicPr>
@@ -30204,7 +31560,7 @@
                 <wp:inline distT="0" distB="0" distL="0" distR="0">
                   <wp:extent cx="2219325" cy="2152650"/>
                   <wp:effectExtent t="0" r="0" b="0" l="0"/>
-                  <wp:docPr id="1035" name="apontamento-1440-light.jpg" descr="apontamento-1440-light.jpg" title="apontamento-1440-light.jpg"/>
+                  <wp:docPr id="35" name="apontamento-1440-light.jpg" descr="apontamento-1440-light.jpg" title="apontamento-1440-light.jpg"/>
                   <wp:cNvGraphicFramePr>
                     <a:graphicFrameLocks xmlns:a="http://schemas.openxmlformats.org/drawingml/2006/main" noChangeAspect="1"/>
                   </wp:cNvGraphicFramePr>
@@ -30212,7 +31568,7 @@
                     <a:graphicData uri="http://schemas.openxmlformats.org/drawingml/2006/picture">
                       <pic:pic xmlns:pic="http://schemas.openxmlformats.org/drawingml/2006/picture">
                         <pic:nvPicPr>
-                          <pic:cNvPr id="1035" name="" descr=""/>
+                          <pic:cNvPr id="0" name="" descr=""/>
                           <pic:cNvPicPr>
                             <a:picLocks noChangeAspect="1" noChangeArrowheads="1"/>
                           </pic:cNvPicPr>
@@ -30333,7 +31689,7 @@
                 <wp:inline distT="0" distB="0" distL="0" distR="0">
                   <wp:extent cx="3448050" cy="2152650"/>
                   <wp:effectExtent t="0" r="0" b="0" l="0"/>
-                  <wp:docPr id="1036" name="feedbacks-conversa-1440-light.jpg" descr="feedbacks-conversa-1440-light.jpg" title="feedbacks-conversa-1440-light.jpg"/>
+                  <wp:docPr id="36" name="feedbacks-conversa-1440-light.jpg" descr="feedbacks-conversa-1440-light.jpg" title="feedbacks-conversa-1440-light.jpg"/>
                   <wp:cNvGraphicFramePr>
                     <a:graphicFrameLocks xmlns:a="http://schemas.openxmlformats.org/drawingml/2006/main" noChangeAspect="1"/>
                   </wp:cNvGraphicFramePr>
@@ -30341,7 +31697,7 @@
                     <a:graphicData uri="http://schemas.openxmlformats.org/drawingml/2006/picture">
                       <pic:pic xmlns:pic="http://schemas.openxmlformats.org/drawingml/2006/picture">
                         <pic:nvPicPr>
-                          <pic:cNvPr id="1036" name="" descr=""/>
+                          <pic:cNvPr id="0" name="" descr=""/>
                           <pic:cNvPicPr>
                             <a:picLocks noChangeAspect="1" noChangeArrowheads="1"/>
                           </pic:cNvPicPr>

</xml_diff>